<commit_message>
Sync updated CV and online HTML
</commit_message>
<xml_diff>
--- a/MGarcia_CV_Redesigned_2026.docx
+++ b/MGarcia_CV_Redesigned_2026.docx
@@ -4,6 +4,8 @@
   <w:body>
     <w:p>
       <w:pPr>
+        <w:keepLines w:val="1"/>
+        <w:widowControl w:val="1"/>
         <w:spacing w:before="0" w:after="40"/>
       </w:pPr>
       <w:r>
@@ -17,6 +19,8 @@
     </w:p>
     <w:p>
       <w:pPr>
+        <w:keepLines w:val="1"/>
+        <w:widowControl w:val="1"/>
         <w:spacing w:before="0" w:after="80"/>
       </w:pPr>
       <w:r>
@@ -25,11 +29,13 @@
           <w:sz w:val="22"/>
           <w:color w:val="1E40AF"/>
         </w:rPr>
-        <w:t>Lead Platform Engineer | Senior DevOps &amp; SRE Specialist | Cloud Solutions Architect</w:t>
-      </w:r>
-    </w:p>
-    <w:p>
-      <w:pPr>
+        <w:t>Senior Platform Engineer | Senior DevOps &amp; SRE Specialist | Cloud Solutions Architect</w:t>
+      </w:r>
+    </w:p>
+    <w:p>
+      <w:pPr>
+        <w:keepLines w:val="1"/>
+        <w:widowControl w:val="1"/>
         <w:pBdr>
           <w:bottom w:val="single" w:sz="8" w:space="8" w:color="0F294A"/>
         </w:pBdr>
@@ -40,11 +46,14 @@
           <w:sz w:val="18"/>
           <w:color w:val="475569"/>
         </w:rPr>
-        <w:t>Stockholm, Sweden  •  +46 7 323 90562  •  marcelo.garcia@linux.com  •  linkedin.com/in/marcelodevops  •  github.com/marcelodevops</w:t>
-      </w:r>
-    </w:p>
-    <w:p>
-      <w:pPr>
+        <w:t>Santiago, Chile  •  +56 9 3194 2642  •  marcelo.garcia@linux.com  •  linkedin.com/in/marcelodevops  •  github.com/marcelodevops</w:t>
+      </w:r>
+    </w:p>
+    <w:p>
+      <w:pPr>
+        <w:keepNext w:val="1"/>
+        <w:keepLines w:val="1"/>
+        <w:widowControl w:val="1"/>
         <w:pBdr>
           <w:bottom w:val="single" w:sz="6" w:space="4" w:color="CBD5E1"/>
         </w:pBdr>
@@ -61,6 +70,8 @@
     </w:p>
     <w:p>
       <w:pPr>
+        <w:keepLines w:val="1"/>
+        <w:widowControl w:val="1"/>
         <w:spacing w:before="0" w:after="60"/>
       </w:pPr>
       <w:r>
@@ -68,11 +79,14 @@
           <w:sz w:val="20"/>
           <w:color w:val="334155"/>
         </w:rPr>
-        <w:t>Senior Platform Engineer and DevOps/SRE Leader with 21+ years of overall IT experience and 10+ years architecting, securing, and scaling cloud-native infrastructure across AWS, Google Cloud, and Azure. Deep technical authority in Kubernetes orchestration (EKS/GKE), GitOps automation (ArgoCD), service mesh (Istio), automated IaC (Terraform, Pulumi), and enterprise observability (Prometheus, Grafana, Loki, Datadog). Proven track record of slashing cloud operational costs by up to 40% and accelerating delivery velocity from hours to minutes, combined with pioneering work in agentic engineering, local LLM tooling, and autonomous workflow runtimes.</w:t>
-      </w:r>
-    </w:p>
-    <w:p>
-      <w:pPr>
+        <w:t>Senior Platform Engineer and DevOps/SRE Leader with 21+ years of overall IT experience and 10+ years architecting, securing, and scaling cloud-native infrastructure across AWS, Google Cloud, and Azure. Deep technical authority in Kubernetes orchestration (EKS/GKE/AKS), GitOps automation (ArgoCD), service mesh (Istio), automated IaC (Terraform, Pulumi), and enterprise observability (Prometheus, Grafana, Loki, Datadog). Proven track record of slashing cloud operational costs by up to 40% and accelerating delivery velocity from hours to minutes, combined with pioneering work in agentic engineering, local LLM tooling, and autonomous workflow runtimes.</w:t>
+      </w:r>
+    </w:p>
+    <w:p>
+      <w:pPr>
+        <w:keepNext w:val="1"/>
+        <w:keepLines w:val="1"/>
+        <w:widowControl w:val="1"/>
         <w:pBdr>
           <w:bottom w:val="single" w:sz="6" w:space="4" w:color="CBD5E1"/>
         </w:pBdr>
@@ -89,6 +103,8 @@
     </w:p>
     <w:p>
       <w:pPr>
+        <w:keepLines w:val="1"/>
+        <w:widowControl w:val="1"/>
         <w:ind w:left="240" w:hanging="240"/>
         <w:spacing w:before="20" w:after="40"/>
       </w:pPr>
@@ -105,11 +121,13 @@
           <w:sz w:val="19"/>
           <w:color w:val="334155"/>
         </w:rPr>
-        <w:t>AWS (EKS, ECS, Lambda, RDS, S3, Route53, EMR, Kinesis, Batch), Google Cloud Platform (GKE, BigQuery, Pub/Sub, Dataflow, Cloud Run), Azure (Functions, Monitor, DevOps), Google Distributed Cloud (Anthos), Serverless Stack (SST), AWS CDK</w:t>
-      </w:r>
-    </w:p>
-    <w:p>
-      <w:pPr>
+        <w:t>AWS (EKS, ECS, Lambda, RDS, S3, Route53, EMR, Kinesis, Batch), Google Cloud Platform (GKE, BigQuery, Pub/Sub, Dataflow, Cloud Run), Azure (AKS, Functions, Monitor, DevOps), Google Distributed Cloud (Anthos), Serverless Stack (SST), AWS CDK</w:t>
+      </w:r>
+    </w:p>
+    <w:p>
+      <w:pPr>
+        <w:keepLines w:val="1"/>
+        <w:widowControl w:val="1"/>
         <w:ind w:left="240" w:hanging="240"/>
         <w:spacing w:before="20" w:after="40"/>
       </w:pPr>
@@ -126,11 +144,13 @@
           <w:sz w:val="19"/>
           <w:color w:val="334155"/>
         </w:rPr>
-        <w:t>Kubernetes (EKS, GKE, KOPS, Architecture &amp; Admin), Docker, ArgoCD, Helm / Helmfile, Kustomize, Istio Service Mesh, Karpenter, Kyverno, OpenShift</w:t>
-      </w:r>
-    </w:p>
-    <w:p>
-      <w:pPr>
+        <w:t>Kubernetes (EKS, GKE, AKS, kOps, Architecture &amp; Admin), Docker, ArgoCD, Helm / Helmfile, Kustomize, Istio Service Mesh, Karpenter, Kyverno, OpenShift</w:t>
+      </w:r>
+    </w:p>
+    <w:p>
+      <w:pPr>
+        <w:keepLines w:val="1"/>
+        <w:widowControl w:val="1"/>
         <w:ind w:left="240" w:hanging="240"/>
         <w:spacing w:before="20" w:after="40"/>
       </w:pPr>
@@ -152,6 +172,8 @@
     </w:p>
     <w:p>
       <w:pPr>
+        <w:keepLines w:val="1"/>
+        <w:widowControl w:val="1"/>
         <w:ind w:left="240" w:hanging="240"/>
         <w:spacing w:before="20" w:after="40"/>
       </w:pPr>
@@ -173,6 +195,8 @@
     </w:p>
     <w:p>
       <w:pPr>
+        <w:keepLines w:val="1"/>
+        <w:widowControl w:val="1"/>
         <w:ind w:left="240" w:hanging="240"/>
         <w:spacing w:before="20" w:after="40"/>
       </w:pPr>
@@ -194,6 +218,8 @@
     </w:p>
     <w:p>
       <w:pPr>
+        <w:keepLines w:val="1"/>
+        <w:widowControl w:val="1"/>
         <w:ind w:left="240" w:hanging="240"/>
         <w:spacing w:before="20" w:after="40"/>
       </w:pPr>
@@ -203,18 +229,20 @@
           <w:sz w:val="19"/>
           <w:color w:val="0F294A"/>
         </w:rPr>
-        <w:t xml:space="preserve">• Languages &amp; Data Platforms: </w:t>
-      </w:r>
-      <w:r>
-        <w:rPr>
-          <w:sz w:val="19"/>
-          <w:color w:val="334155"/>
-        </w:rPr>
-        <w:t>Python (FastAPI, Scripting), Go (Golang), TypeScript / Node.js, Bash Scripting, Apache Kafka, Apache Spark, PostgreSQL, MongoDB, ClickHouse, Redis / Valkey</w:t>
-      </w:r>
-    </w:p>
-    <w:p>
-      <w:pPr>
+        <w:t xml:space="preserve">• Languages, Data &amp; BI Platforms: </w:t>
+      </w:r>
+      <w:r>
+        <w:rPr>
+          <w:sz w:val="19"/>
+          <w:color w:val="334155"/>
+        </w:rPr>
+        <w:t>Python (FastAPI, Scripting), Go (Golang), TypeScript / Node.js, Bash Scripting, Apache Kafka, Apache Spark, PostgreSQL, MongoDB, ClickHouse, Redis / Valkey, Microsoft Fabric, Power BI</w:t>
+      </w:r>
+    </w:p>
+    <w:p>
+      <w:pPr>
+        <w:keepLines w:val="1"/>
+        <w:widowControl w:val="1"/>
         <w:ind w:left="240" w:hanging="240"/>
         <w:spacing w:before="20" w:after="40"/>
       </w:pPr>
@@ -224,18 +252,21 @@
           <w:sz w:val="19"/>
           <w:color w:val="0F294A"/>
         </w:rPr>
-        <w:t xml:space="preserve">• AI &amp; Agentic Engineering: </w:t>
-      </w:r>
-      <w:r>
-        <w:rPr>
-          <w:sz w:val="19"/>
-          <w:color w:val="334155"/>
-        </w:rPr>
-        <w:t>LangChain, OpenAI API, Ollama, Qwen / DeepSeek Runtimes, Agent Observability &amp; Evaluation, LangSmith, Terminal Agent Tooling (Ghostty, Zed)</w:t>
-      </w:r>
-    </w:p>
-    <w:p>
-      <w:pPr>
+        <w:t xml:space="preserve">• AI, MLOps &amp; Agentic Engineering: </w:t>
+      </w:r>
+      <w:r>
+        <w:rPr>
+          <w:sz w:val="19"/>
+          <w:color w:val="334155"/>
+        </w:rPr>
+        <w:t>Kubeflow, Amazon SageMaker, Amazon Bedrock, Microsoft Copilot Studio, LangChain, Azure OpenAI / OpenAI API, Ollama, Qwen / DeepSeek Runtimes, Agent Observability &amp; Evaluation, LangSmith, Developer &amp; Terminal Tooling (Ghostty, Zed)</w:t>
+      </w:r>
+    </w:p>
+    <w:p>
+      <w:pPr>
+        <w:keepNext w:val="1"/>
+        <w:keepLines w:val="1"/>
+        <w:widowControl w:val="1"/>
         <w:pBdr>
           <w:bottom w:val="single" w:sz="6" w:space="4" w:color="CBD5E1"/>
         </w:pBdr>
@@ -252,6 +283,9 @@
     </w:p>
     <w:p>
       <w:pPr>
+        <w:keepNext w:val="1"/>
+        <w:keepLines w:val="1"/>
+        <w:widowControl w:val="1"/>
         <w:tabs>
           <w:tab w:val="right" w:pos="10106"/>
         </w:tabs>
@@ -263,7 +297,7 @@
           <w:sz w:val="21"/>
           <w:color w:val="0F294A"/>
         </w:rPr>
-        <w:t>Senior DevOps &amp; Platform Engineer (Agentic Engineering)</w:t>
+        <w:t>Senior DevOps &amp; Platform Engineer (Contract)</w:t>
       </w:r>
       <w:r>
         <w:rPr>
@@ -278,7 +312,7 @@
           <w:sz w:val="20"/>
           <w:color w:val="1E40AF"/>
         </w:rPr>
-        <w:t>Freight Forwarder Chile</w:t>
+        <w:t>Taina — Freight Forwarder Chile</w:t>
       </w:r>
       <w:r>
         <w:tab/>
@@ -289,18 +323,21 @@
           <w:sz w:val="19"/>
           <w:color w:val="334155"/>
         </w:rPr>
-        <w:t>03/2025 – Present</w:t>
+        <w:t>03/2025 – 05/2026</w:t>
       </w:r>
       <w:r>
         <w:rPr>
           <w:sz w:val="18"/>
           <w:color w:val="64748B"/>
         </w:rPr>
-        <w:t xml:space="preserve"> (Remote / Santiago)</w:t>
-      </w:r>
-    </w:p>
-    <w:p>
-      <w:pPr>
+        <w:t xml:space="preserve"> (Remote / Santiago, Chile)</w:t>
+      </w:r>
+    </w:p>
+    <w:p>
+      <w:pPr>
+        <w:keepNext w:val="1"/>
+        <w:keepLines w:val="1"/>
+        <w:widowControl w:val="1"/>
         <w:ind w:left="360" w:hanging="240"/>
         <w:spacing w:before="0" w:after="40"/>
       </w:pPr>
@@ -324,11 +361,14 @@
           <w:sz w:val="19"/>
           <w:color w:val="334155"/>
         </w:rPr>
-        <w:t>Architected and provisioned an enterprise EKS platform utilizing Terraform, EKS Pod Identity, Karpenter Spot autoscaling, and ArgoCD with automated synchronization, self-healing, and drift detection.</w:t>
-      </w:r>
-    </w:p>
-    <w:p>
-      <w:pPr>
+        <w:t>Designed a Terraform-based Amazon EKS platform using EKS Pod Identity, Karpenter Spot autoscaling, and ArgoCD with automated synchronization, self-healing, and pruning.</w:t>
+      </w:r>
+    </w:p>
+    <w:p>
+      <w:pPr>
+        <w:keepNext w:val="1"/>
+        <w:keepLines w:val="1"/>
+        <w:widowControl w:val="1"/>
         <w:ind w:left="360" w:hanging="240"/>
         <w:spacing w:before="0" w:after="40"/>
       </w:pPr>
@@ -352,11 +392,14 @@
           <w:sz w:val="19"/>
           <w:color w:val="334155"/>
         </w:rPr>
-        <w:t>Led Istio production-readiness and capacity assessments for onboarding ~96,000 transactions/minute onto shared ingress infrastructure; resolved scaling bottlenecks at 4/4 replicas and defined automated rollback guardrails for a 3x traffic expansion.</w:t>
-      </w:r>
-    </w:p>
-    <w:p>
-      <w:pPr>
+        <w:t>Led Istio production-readiness and capacity assessments for onboarding ~96,000 transactions/minute onto shared ingress infrastructure; identified exhausted autoscaling headroom at 4/4 replicas and defined load testing, monitoring, staged rollout, and rollback requirements for a projected 3x traffic increase.</w:t>
+      </w:r>
+    </w:p>
+    <w:p>
+      <w:pPr>
+        <w:keepNext w:val="1"/>
+        <w:keepLines w:val="1"/>
+        <w:widowControl w:val="1"/>
         <w:ind w:left="360" w:hanging="240"/>
         <w:spacing w:before="0" w:after="40"/>
       </w:pPr>
@@ -380,11 +423,14 @@
           <w:sz w:val="19"/>
           <w:color w:val="334155"/>
         </w:rPr>
-        <w:t>Resolved a critical 1.8 GiB memory over-reporting anomaly in Istio sidecars by cross-correlating Envoy, cAdvisor, and Prometheus telemetry, proving actual consumption at 199 MiB and correcting dashboard aggregation metrics.</w:t>
-      </w:r>
-    </w:p>
-    <w:p>
-      <w:pPr>
+        <w:t>Investigated reported Istio sidecar memory consumption using Envoy, cAdvisor, and Prometheus telemetry; measured approximately 199 MiB of utilization and identified dashboard aggregation as the likely source of a 1.8 GiB discrepancy.</w:t>
+      </w:r>
+    </w:p>
+    <w:p>
+      <w:pPr>
+        <w:keepNext w:val="1"/>
+        <w:keepLines w:val="1"/>
+        <w:widowControl w:val="1"/>
         <w:ind w:left="360" w:hanging="240"/>
         <w:spacing w:before="0" w:after="40"/>
       </w:pPr>
@@ -408,39 +454,44 @@
           <w:sz w:val="19"/>
           <w:color w:val="334155"/>
         </w:rPr>
-        <w:t>Hardened Kubernetes secrets architecture with CyberArk Conjur OSS and External Secrets Operator, addressing CA trust, SAN validation, JWT service-account identity, and JWKS audience verification.</w:t>
-      </w:r>
-    </w:p>
-    <w:p>
-      <w:pPr>
-        <w:ind w:left="360" w:hanging="240"/>
-        <w:spacing w:before="0" w:after="40"/>
-      </w:pPr>
-      <w:r>
-        <w:rPr>
-          <w:sz w:val="19"/>
-          <w:color w:val="1E40AF"/>
-        </w:rPr>
-        <w:t xml:space="preserve">▪  </w:t>
-      </w:r>
-      <w:r>
-        <w:rPr>
-          <w:b/>
-          <w:sz w:val="19"/>
-          <w:color w:val="0F294A"/>
-        </w:rPr>
-        <w:t xml:space="preserve">Agentic Logistics Automation: </w:t>
-      </w:r>
-      <w:r>
-        <w:rPr>
-          <w:sz w:val="19"/>
-          <w:color w:val="334155"/>
-        </w:rPr>
-        <w:t>Engineered microservices in Python (FastAPI) and an autonomous logistics agent system using LangChain and OpenAI API to automate multi-variable load assignments to vessels based on cargo dimensions, routes, and operational priority.</w:t>
-      </w:r>
-    </w:p>
-    <w:p>
-      <w:pPr>
+        <w:t>Hardened Kubernetes secrets architecture with CyberArk Conjur OSS and External Secrets Operator, addressing CA trust, SAN validation, JWT service-account identity, and OIDC issuer, audience, and JWKS configuration.</w:t>
+      </w:r>
+    </w:p>
+    <w:p>
+      <w:pPr>
+        <w:keepLines w:val="1"/>
+        <w:widowControl w:val="1"/>
+        <w:ind w:left="360" w:hanging="240"/>
+        <w:spacing w:before="0" w:after="40"/>
+      </w:pPr>
+      <w:r>
+        <w:rPr>
+          <w:sz w:val="19"/>
+          <w:color w:val="1E40AF"/>
+        </w:rPr>
+        <w:t xml:space="preserve">▪  </w:t>
+      </w:r>
+      <w:r>
+        <w:rPr>
+          <w:b/>
+          <w:sz w:val="19"/>
+          <w:color w:val="0F294A"/>
+        </w:rPr>
+        <w:t xml:space="preserve">Agentic Logistics &amp; Local LLM Tooling: </w:t>
+      </w:r>
+      <w:r>
+        <w:rPr>
+          <w:sz w:val="19"/>
+          <w:color w:val="334155"/>
+        </w:rPr>
+        <w:t>Built Python (FastAPI) microservices and an agentic logistics system using LangChain and Azure OpenAI to assign cargo to vessels based on dimensions, routes, and priorities, deployed on Azure Kubernetes Service (AKS); evaluated local LLM runtimes (Ollama, Qwen, DeepSeek) with LangSmith tracing.</w:t>
+      </w:r>
+    </w:p>
+    <w:p>
+      <w:pPr>
+        <w:keepNext w:val="1"/>
+        <w:keepLines w:val="1"/>
+        <w:widowControl w:val="1"/>
         <w:tabs>
           <w:tab w:val="right" w:pos="10106"/>
         </w:tabs>
@@ -490,6 +541,9 @@
     </w:p>
     <w:p>
       <w:pPr>
+        <w:keepNext w:val="1"/>
+        <w:keepLines w:val="1"/>
+        <w:widowControl w:val="1"/>
         <w:ind w:left="360" w:hanging="240"/>
         <w:spacing w:before="0" w:after="40"/>
       </w:pPr>
@@ -518,6 +572,9 @@
     </w:p>
     <w:p>
       <w:pPr>
+        <w:keepNext w:val="1"/>
+        <w:keepLines w:val="1"/>
+        <w:widowControl w:val="1"/>
         <w:ind w:left="360" w:hanging="240"/>
         <w:spacing w:before="0" w:after="40"/>
       </w:pPr>
@@ -546,6 +603,9 @@
     </w:p>
     <w:p>
       <w:pPr>
+        <w:keepNext w:val="1"/>
+        <w:keepLines w:val="1"/>
+        <w:widowControl w:val="1"/>
         <w:ind w:left="360" w:hanging="240"/>
         <w:spacing w:before="0" w:after="40"/>
       </w:pPr>
@@ -574,6 +634,8 @@
     </w:p>
     <w:p>
       <w:pPr>
+        <w:keepLines w:val="1"/>
+        <w:widowControl w:val="1"/>
         <w:ind w:left="360" w:hanging="240"/>
         <w:spacing w:before="0" w:after="40"/>
       </w:pPr>
@@ -602,6 +664,9 @@
     </w:p>
     <w:p>
       <w:pPr>
+        <w:keepNext w:val="1"/>
+        <w:keepLines w:val="1"/>
+        <w:widowControl w:val="1"/>
         <w:tabs>
           <w:tab w:val="right" w:pos="10106"/>
         </w:tabs>
@@ -651,6 +716,9 @@
     </w:p>
     <w:p>
       <w:pPr>
+        <w:keepNext w:val="1"/>
+        <w:keepLines w:val="1"/>
+        <w:widowControl w:val="1"/>
         <w:ind w:left="360" w:hanging="240"/>
         <w:spacing w:before="0" w:after="40"/>
       </w:pPr>
@@ -674,11 +742,14 @@
           <w:sz w:val="19"/>
           <w:color w:val="334155"/>
         </w:rPr>
-        <w:t>Executed an accelerated 3-month zero-downtime migration from on-premises Docker Swarm to AWS, migrating 50+ Java microservices to Amazon EKS and 15+ distributed stateful platforms (Kafka, ZooKeeper, RabbitMQ, MongoDB, MSSQL) to EC2 and RDS.</w:t>
-      </w:r>
-    </w:p>
-    <w:p>
-      <w:pPr>
+        <w:t>Delivered a cloud migration against a tight 3-month deadline from on-premises Docker Swarm to AWS, migrating approximately 50 Java microservices to Amazon EKS and approximately 15 distributed stateful platforms (Kafka, ZooKeeper, RabbitMQ, MongoDB, MSSQL) to EC2 and RDS.</w:t>
+      </w:r>
+    </w:p>
+    <w:p>
+      <w:pPr>
+        <w:keepNext w:val="1"/>
+        <w:keepLines w:val="1"/>
+        <w:widowControl w:val="1"/>
         <w:ind w:left="360" w:hanging="240"/>
         <w:spacing w:before="0" w:after="40"/>
       </w:pPr>
@@ -707,6 +778,9 @@
     </w:p>
     <w:p>
       <w:pPr>
+        <w:keepNext w:val="1"/>
+        <w:keepLines w:val="1"/>
+        <w:widowControl w:val="1"/>
         <w:ind w:left="360" w:hanging="240"/>
         <w:spacing w:before="0" w:after="40"/>
       </w:pPr>
@@ -735,34 +809,39 @@
     </w:p>
     <w:p>
       <w:pPr>
-        <w:ind w:left="360" w:hanging="240"/>
-        <w:spacing w:before="0" w:after="40"/>
-      </w:pPr>
-      <w:r>
-        <w:rPr>
-          <w:sz w:val="19"/>
-          <w:color w:val="1E40AF"/>
-        </w:rPr>
-        <w:t xml:space="preserve">▪  </w:t>
-      </w:r>
-      <w:r>
-        <w:rPr>
-          <w:b/>
-          <w:sz w:val="19"/>
-          <w:color w:val="0F294A"/>
-        </w:rPr>
-        <w:t xml:space="preserve">IaC &amp; Database Modernization: </w:t>
-      </w:r>
-      <w:r>
-        <w:rPr>
-          <w:sz w:val="19"/>
-          <w:color w:val="334155"/>
-        </w:rPr>
-        <w:t>Automated multi-account provisioning using Terraform and AWS CDK with Go; orchestrated robust database cutovers and backup/restore automations for MongoDB and MSSQL to RDS.</w:t>
-      </w:r>
-    </w:p>
-    <w:p>
-      <w:pPr>
+        <w:keepLines w:val="1"/>
+        <w:widowControl w:val="1"/>
+        <w:ind w:left="360" w:hanging="240"/>
+        <w:spacing w:before="0" w:after="40"/>
+      </w:pPr>
+      <w:r>
+        <w:rPr>
+          <w:sz w:val="19"/>
+          <w:color w:val="1E40AF"/>
+        </w:rPr>
+        <w:t xml:space="preserve">▪  </w:t>
+      </w:r>
+      <w:r>
+        <w:rPr>
+          <w:b/>
+          <w:sz w:val="19"/>
+          <w:color w:val="0F294A"/>
+        </w:rPr>
+        <w:t xml:space="preserve">IaC, Observability &amp; Database Modernization: </w:t>
+      </w:r>
+      <w:r>
+        <w:rPr>
+          <w:sz w:val="19"/>
+          <w:color w:val="334155"/>
+        </w:rPr>
+        <w:t>Automated infrastructure provisioning using Terraform and AWS CDK with Go; integrated Datadog and ELK Stack monitoring across migrated workloads, and orchestrated MongoDB and MSSQL cutovers to AWS RDS.</w:t>
+      </w:r>
+    </w:p>
+    <w:p>
+      <w:pPr>
+        <w:keepNext w:val="1"/>
+        <w:keepLines w:val="1"/>
+        <w:widowControl w:val="1"/>
         <w:tabs>
           <w:tab w:val="right" w:pos="10106"/>
         </w:tabs>
@@ -812,34 +891,40 @@
     </w:p>
     <w:p>
       <w:pPr>
-        <w:ind w:left="360" w:hanging="240"/>
-        <w:spacing w:before="0" w:after="40"/>
-      </w:pPr>
-      <w:r>
-        <w:rPr>
-          <w:sz w:val="19"/>
-          <w:color w:val="1E40AF"/>
-        </w:rPr>
-        <w:t xml:space="preserve">▪  </w:t>
-      </w:r>
-      <w:r>
-        <w:rPr>
-          <w:b/>
-          <w:sz w:val="19"/>
-          <w:color w:val="0F294A"/>
-        </w:rPr>
-        <w:t xml:space="preserve">Enterprise Data Mesh Architecture: </w:t>
-      </w:r>
-      <w:r>
-        <w:rPr>
-          <w:sz w:val="19"/>
-          <w:color w:val="334155"/>
-        </w:rPr>
-        <w:t>Built and validated a Google Cloud Proof of Concept (POC) transforming monolithic analytics into a decentralized Data Mesh model, migrating enterprise data assets from Azure Storage to Google BigQuery.</w:t>
-      </w:r>
-    </w:p>
-    <w:p>
-      <w:pPr>
+        <w:keepNext w:val="1"/>
+        <w:keepLines w:val="1"/>
+        <w:widowControl w:val="1"/>
+        <w:ind w:left="360" w:hanging="240"/>
+        <w:spacing w:before="0" w:after="40"/>
+      </w:pPr>
+      <w:r>
+        <w:rPr>
+          <w:sz w:val="19"/>
+          <w:color w:val="1E40AF"/>
+        </w:rPr>
+        <w:t xml:space="preserve">▪  </w:t>
+      </w:r>
+      <w:r>
+        <w:rPr>
+          <w:b/>
+          <w:sz w:val="19"/>
+          <w:color w:val="0F294A"/>
+        </w:rPr>
+        <w:t xml:space="preserve">Data Mesh Proof of Concept: </w:t>
+      </w:r>
+      <w:r>
+        <w:rPr>
+          <w:sz w:val="19"/>
+          <w:color w:val="334155"/>
+        </w:rPr>
+        <w:t>Worked on a Google Cloud Data Mesh proof of concept and served as a technical reference for the planned migration of data assets from Azure Storage to Google BigQuery.</w:t>
+      </w:r>
+    </w:p>
+    <w:p>
+      <w:pPr>
+        <w:keepNext w:val="1"/>
+        <w:keepLines w:val="1"/>
+        <w:widowControl w:val="1"/>
         <w:ind w:left="360" w:hanging="240"/>
         <w:spacing w:before="0" w:after="40"/>
       </w:pPr>
@@ -863,39 +948,44 @@
           <w:sz w:val="19"/>
           <w:color w:val="334155"/>
         </w:rPr>
-        <w:t>Architected Apache Kafka streaming pipelines utilizing custom Google Cloud Dataflow Flex Templates to stream real-time events into BigQuery and Pub/Sub.</w:t>
-      </w:r>
-    </w:p>
-    <w:p>
-      <w:pPr>
-        <w:ind w:left="360" w:hanging="240"/>
-        <w:spacing w:before="0" w:after="40"/>
-      </w:pPr>
-      <w:r>
-        <w:rPr>
-          <w:sz w:val="19"/>
-          <w:color w:val="1E40AF"/>
-        </w:rPr>
-        <w:t xml:space="preserve">▪  </w:t>
-      </w:r>
-      <w:r>
-        <w:rPr>
-          <w:b/>
-          <w:sz w:val="19"/>
-          <w:color w:val="0F294A"/>
-        </w:rPr>
-        <w:t xml:space="preserve">Centralized Secrets Management: </w:t>
-      </w:r>
-      <w:r>
-        <w:rPr>
-          <w:sz w:val="19"/>
-          <w:color w:val="334155"/>
-        </w:rPr>
-        <w:t>Designed and deployed HashiCorp Vault on Google Kubernetes Engine (GKE) via Terraform, delivering automated, identity-based secret distribution across heterogeneous cloud environments.</w:t>
-      </w:r>
-    </w:p>
-    <w:p>
-      <w:pPr>
+        <w:t>Implemented Apache Kafka streaming pipelines utilizing custom Google Cloud Dataflow Flex Templates to stream real-time events into BigQuery and Pub/Sub.</w:t>
+      </w:r>
+    </w:p>
+    <w:p>
+      <w:pPr>
+        <w:keepNext w:val="1"/>
+        <w:keepLines w:val="1"/>
+        <w:widowControl w:val="1"/>
+        <w:ind w:left="360" w:hanging="240"/>
+        <w:spacing w:before="0" w:after="40"/>
+      </w:pPr>
+      <w:r>
+        <w:rPr>
+          <w:sz w:val="19"/>
+          <w:color w:val="1E40AF"/>
+        </w:rPr>
+        <w:t xml:space="preserve">▪  </w:t>
+      </w:r>
+      <w:r>
+        <w:rPr>
+          <w:b/>
+          <w:sz w:val="19"/>
+          <w:color w:val="0F294A"/>
+        </w:rPr>
+        <w:t xml:space="preserve">Multi-Cloud Secrets Management PoC: </w:t>
+      </w:r>
+      <w:r>
+        <w:rPr>
+          <w:sz w:val="19"/>
+          <w:color w:val="334155"/>
+        </w:rPr>
+        <w:t>Developed two proofs of concept, one on Google Cloud Platform (GCP) and another on Azure Kubernetes Service (AKS), to test HashiCorp Vault secrets management across multi-cloud environments.</w:t>
+      </w:r>
+    </w:p>
+    <w:p>
+      <w:pPr>
+        <w:keepLines w:val="1"/>
+        <w:widowControl w:val="1"/>
         <w:ind w:left="360" w:hanging="240"/>
         <w:spacing w:before="0" w:after="40"/>
       </w:pPr>
@@ -919,11 +1009,14 @@
           <w:sz w:val="19"/>
           <w:color w:val="334155"/>
         </w:rPr>
-        <w:t>Built reusable GitHub Actions workflows across GCP, Azure, and AWS; integrated Grafana with Azure Monitor to provide unified SLI/SLO visibility and operational KPIs.</w:t>
-      </w:r>
-    </w:p>
-    <w:p>
-      <w:pPr>
+        <w:t>Built reusable GitHub Actions workflows across GCP, Azure, and AWS; added Grafana dashboards and operational KPIs, and used Azure Monitor to improve application visibility.</w:t>
+      </w:r>
+    </w:p>
+    <w:p>
+      <w:pPr>
+        <w:keepNext w:val="1"/>
+        <w:keepLines w:val="1"/>
+        <w:widowControl w:val="1"/>
         <w:tabs>
           <w:tab w:val="right" w:pos="10106"/>
         </w:tabs>
@@ -973,6 +1066,9 @@
     </w:p>
     <w:p>
       <w:pPr>
+        <w:keepNext w:val="1"/>
+        <w:keepLines w:val="1"/>
+        <w:widowControl w:val="1"/>
         <w:ind w:left="360" w:hanging="240"/>
         <w:spacing w:before="0" w:after="40"/>
       </w:pPr>
@@ -996,11 +1092,14 @@
           <w:sz w:val="19"/>
           <w:color w:val="334155"/>
         </w:rPr>
-        <w:t>Led the DevOps and SRE chapter, establishing technical competency matrices, career progression frameworks, and a blameless post-mortem culture fostering innovation and continuous learning.</w:t>
-      </w:r>
-    </w:p>
-    <w:p>
-      <w:pPr>
+        <w:t>Led the DevOps and SRE chapter, establishing technical competency matrices, learning plans, and a blameless team culture supporting experimentation and continuous learning.</w:t>
+      </w:r>
+    </w:p>
+    <w:p>
+      <w:pPr>
+        <w:keepNext w:val="1"/>
+        <w:keepLines w:val="1"/>
+        <w:widowControl w:val="1"/>
         <w:ind w:left="360" w:hanging="240"/>
         <w:spacing w:before="0" w:after="40"/>
       </w:pPr>
@@ -1029,6 +1128,8 @@
     </w:p>
     <w:p>
       <w:pPr>
+        <w:keepLines w:val="1"/>
+        <w:widowControl w:val="1"/>
         <w:ind w:left="360" w:hanging="240"/>
         <w:spacing w:before="0" w:after="40"/>
       </w:pPr>
@@ -1057,6 +1158,9 @@
     </w:p>
     <w:p>
       <w:pPr>
+        <w:keepNext w:val="1"/>
+        <w:keepLines w:val="1"/>
+        <w:widowControl w:val="1"/>
         <w:tabs>
           <w:tab w:val="right" w:pos="10106"/>
         </w:tabs>
@@ -1101,11 +1205,14 @@
           <w:sz w:val="18"/>
           <w:color w:val="64748B"/>
         </w:rPr>
-        <w:t xml:space="preserve"> (Remote (UK, Australia, USA))</w:t>
-      </w:r>
-    </w:p>
-    <w:p>
-      <w:pPr>
+        <w:t xml:space="preserve"> (Remote — UK, Australia, USA)</w:t>
+      </w:r>
+    </w:p>
+    <w:p>
+      <w:pPr>
+        <w:keepNext w:val="1"/>
+        <w:keepLines w:val="1"/>
+        <w:widowControl w:val="1"/>
         <w:ind w:left="360" w:hanging="240"/>
         <w:spacing w:before="0" w:after="40"/>
       </w:pPr>
@@ -1134,6 +1241,9 @@
     </w:p>
     <w:p>
       <w:pPr>
+        <w:keepNext w:val="1"/>
+        <w:keepLines w:val="1"/>
+        <w:widowControl w:val="1"/>
         <w:ind w:left="360" w:hanging="240"/>
         <w:spacing w:before="0" w:after="40"/>
       </w:pPr>
@@ -1157,11 +1267,13 @@
           <w:sz w:val="19"/>
           <w:color w:val="334155"/>
         </w:rPr>
-        <w:t>Configured and managed Kubernetes clusters on GCP with Istio service mesh and the Apigee Istio Adapter (v1.4.1), enforcing strict mTLS encryption and traffic policies.</w:t>
-      </w:r>
-    </w:p>
-    <w:p>
-      <w:pPr>
+        <w:t>Configured and managed Kubernetes clusters on GCP with Istio service mesh and the Apigee Istio Adapter (v1.4.1).</w:t>
+      </w:r>
+    </w:p>
+    <w:p>
+      <w:pPr>
+        <w:keepLines w:val="1"/>
+        <w:widowControl w:val="1"/>
         <w:ind w:left="360" w:hanging="240"/>
         <w:spacing w:before="0" w:after="40"/>
       </w:pPr>
@@ -1185,11 +1297,14 @@
           <w:sz w:val="19"/>
           <w:color w:val="334155"/>
         </w:rPr>
-        <w:t>Engineered and managed resilient, highly available Kubernetes clusters in AWS Canada Central using KOPS with least-privilege IAM security controls prior to regional EKS availability.</w:t>
-      </w:r>
-    </w:p>
-    <w:p>
-      <w:pPr>
+        <w:t>Engineered and managed resilient, highly available Kubernetes clusters in AWS Canada Central using kOps with least-privilege IAM security controls prior to regional EKS availability.</w:t>
+      </w:r>
+    </w:p>
+    <w:p>
+      <w:pPr>
+        <w:keepNext w:val="1"/>
+        <w:keepLines w:val="1"/>
+        <w:widowControl w:val="1"/>
         <w:tabs>
           <w:tab w:val="right" w:pos="10106"/>
         </w:tabs>
@@ -1239,34 +1354,40 @@
     </w:p>
     <w:p>
       <w:pPr>
-        <w:ind w:left="360" w:hanging="240"/>
-        <w:spacing w:before="0" w:after="40"/>
-      </w:pPr>
-      <w:r>
-        <w:rPr>
-          <w:sz w:val="19"/>
-          <w:color w:val="1E40AF"/>
-        </w:rPr>
-        <w:t xml:space="preserve">▪  </w:t>
-      </w:r>
-      <w:r>
-        <w:rPr>
-          <w:b/>
-          <w:sz w:val="19"/>
-          <w:color w:val="0F294A"/>
-        </w:rPr>
-        <w:t xml:space="preserve">Massive Cost Reduction: </w:t>
-      </w:r>
-      <w:r>
-        <w:rPr>
-          <w:sz w:val="19"/>
-          <w:color w:val="334155"/>
-        </w:rPr>
-        <w:t>Slashed AWS cloud infrastructure expenditure by 40% through infrastructure audits, Spot instance adoption, and automated idle resource termination.</w:t>
-      </w:r>
-    </w:p>
-    <w:p>
-      <w:pPr>
+        <w:keepNext w:val="1"/>
+        <w:keepLines w:val="1"/>
+        <w:widowControl w:val="1"/>
+        <w:ind w:left="360" w:hanging="240"/>
+        <w:spacing w:before="0" w:after="40"/>
+      </w:pPr>
+      <w:r>
+        <w:rPr>
+          <w:sz w:val="19"/>
+          <w:color w:val="1E40AF"/>
+        </w:rPr>
+        <w:t xml:space="preserve">▪  </w:t>
+      </w:r>
+      <w:r>
+        <w:rPr>
+          <w:b/>
+          <w:sz w:val="19"/>
+          <w:color w:val="0F294A"/>
+        </w:rPr>
+        <w:t xml:space="preserve">Cloud Cost Optimization: </w:t>
+      </w:r>
+      <w:r>
+        <w:rPr>
+          <w:sz w:val="19"/>
+          <w:color w:val="334155"/>
+        </w:rPr>
+        <w:t>Reduced AWS cloud infrastructure costs by 40% through infrastructure optimization and automation.</w:t>
+      </w:r>
+    </w:p>
+    <w:p>
+      <w:pPr>
+        <w:keepNext w:val="1"/>
+        <w:keepLines w:val="1"/>
+        <w:widowControl w:val="1"/>
         <w:ind w:left="360" w:hanging="240"/>
         <w:spacing w:before="0" w:after="40"/>
       </w:pPr>
@@ -1295,6 +1416,9 @@
     </w:p>
     <w:p>
       <w:pPr>
+        <w:keepNext w:val="1"/>
+        <w:keepLines w:val="1"/>
+        <w:widowControl w:val="1"/>
         <w:ind w:left="360" w:hanging="240"/>
         <w:spacing w:before="0" w:after="40"/>
       </w:pPr>
@@ -1323,6 +1447,9 @@
     </w:p>
     <w:p>
       <w:pPr>
+        <w:keepNext w:val="1"/>
+        <w:keepLines w:val="1"/>
+        <w:widowControl w:val="1"/>
         <w:ind w:left="360" w:hanging="240"/>
         <w:spacing w:before="0" w:after="40"/>
       </w:pPr>
@@ -1351,6 +1478,39 @@
     </w:p>
     <w:p>
       <w:pPr>
+        <w:keepLines w:val="1"/>
+        <w:widowControl w:val="1"/>
+        <w:ind w:left="360" w:hanging="240"/>
+        <w:spacing w:before="0" w:after="40"/>
+      </w:pPr>
+      <w:r>
+        <w:rPr>
+          <w:sz w:val="19"/>
+          <w:color w:val="1E40AF"/>
+        </w:rPr>
+        <w:t xml:space="preserve">▪  </w:t>
+      </w:r>
+      <w:r>
+        <w:rPr>
+          <w:b/>
+          <w:sz w:val="19"/>
+          <w:color w:val="0F294A"/>
+        </w:rPr>
+        <w:t xml:space="preserve">MLOps Workflows: </w:t>
+      </w:r>
+      <w:r>
+        <w:rPr>
+          <w:sz w:val="19"/>
+          <w:color w:val="334155"/>
+        </w:rPr>
+        <w:t>Worked on MLOps workflows using Amazon SageMaker and Kubeflow components.</w:t>
+      </w:r>
+    </w:p>
+    <w:p>
+      <w:pPr>
+        <w:keepNext w:val="1"/>
+        <w:keepLines w:val="1"/>
+        <w:widowControl w:val="1"/>
         <w:tabs>
           <w:tab w:val="right" w:pos="10106"/>
         </w:tabs>
@@ -1362,7 +1522,7 @@
           <w:sz w:val="21"/>
           <w:color w:val="0F294A"/>
         </w:rPr>
-        <w:t>Earlier DevOps &amp; Systems Engineering Roles</w:t>
+        <w:t>Senior DevOps Engineer &amp; Lead Consultant</w:t>
       </w:r>
       <w:r>
         <w:rPr>
@@ -1377,7 +1537,7 @@
           <w:sz w:val="20"/>
           <w:color w:val="1E40AF"/>
         </w:rPr>
-        <w:t>Deloitte Canada | Sonnet | WSIB</w:t>
+        <w:t>Deloitte Canada</w:t>
       </w:r>
       <w:r>
         <w:tab/>
@@ -1400,23 +1560,26 @@
     </w:p>
     <w:p>
       <w:pPr>
-        <w:ind w:left="360" w:hanging="240"/>
-        <w:spacing w:before="0" w:after="40"/>
-      </w:pPr>
-      <w:r>
-        <w:rPr>
-          <w:sz w:val="19"/>
-          <w:color w:val="1E40AF"/>
-        </w:rPr>
-        <w:t xml:space="preserve">▪  </w:t>
-      </w:r>
-      <w:r>
-        <w:rPr>
-          <w:b/>
-          <w:sz w:val="19"/>
-          <w:color w:val="0F294A"/>
-        </w:rPr>
-        <w:t xml:space="preserve">Senior DevOps Engineer Lead (Deloitte): </w:t>
+        <w:keepNext w:val="1"/>
+        <w:keepLines w:val="1"/>
+        <w:widowControl w:val="1"/>
+        <w:ind w:left="360" w:hanging="240"/>
+        <w:spacing w:before="0" w:after="40"/>
+      </w:pPr>
+      <w:r>
+        <w:rPr>
+          <w:sz w:val="19"/>
+          <w:color w:val="1E40AF"/>
+        </w:rPr>
+        <w:t xml:space="preserve">▪  </w:t>
+      </w:r>
+      <w:r>
+        <w:rPr>
+          <w:b/>
+          <w:sz w:val="19"/>
+          <w:color w:val="0F294A"/>
+        </w:rPr>
+        <w:t xml:space="preserve">Senior DevOps Engineer Lead — Deloitte (07/2017 – 01/2018): </w:t>
       </w:r>
       <w:r>
         <w:rPr>
@@ -1428,23 +1591,26 @@
     </w:p>
     <w:p>
       <w:pPr>
-        <w:ind w:left="360" w:hanging="240"/>
-        <w:spacing w:before="0" w:after="40"/>
-      </w:pPr>
-      <w:r>
-        <w:rPr>
-          <w:sz w:val="19"/>
-          <w:color w:val="1E40AF"/>
-        </w:rPr>
-        <w:t xml:space="preserve">▪  </w:t>
-      </w:r>
-      <w:r>
-        <w:rPr>
-          <w:b/>
-          <w:sz w:val="19"/>
-          <w:color w:val="0F294A"/>
-        </w:rPr>
-        <w:t xml:space="preserve">DevOps Lead (Sonnet Insurance): </w:t>
+        <w:keepNext w:val="1"/>
+        <w:keepLines w:val="1"/>
+        <w:widowControl w:val="1"/>
+        <w:ind w:left="360" w:hanging="240"/>
+        <w:spacing w:before="0" w:after="40"/>
+      </w:pPr>
+      <w:r>
+        <w:rPr>
+          <w:sz w:val="19"/>
+          <w:color w:val="1E40AF"/>
+        </w:rPr>
+        <w:t xml:space="preserve">▪  </w:t>
+      </w:r>
+      <w:r>
+        <w:rPr>
+          <w:b/>
+          <w:sz w:val="19"/>
+          <w:color w:val="0F294A"/>
+        </w:rPr>
+        <w:t xml:space="preserve">DevOps Lead — Client: Sonnet Insurance (08/2015 – 06/2017): </w:t>
       </w:r>
       <w:r>
         <w:rPr>
@@ -1456,23 +1622,25 @@
     </w:p>
     <w:p>
       <w:pPr>
-        <w:ind w:left="360" w:hanging="240"/>
-        <w:spacing w:before="0" w:after="40"/>
-      </w:pPr>
-      <w:r>
-        <w:rPr>
-          <w:sz w:val="19"/>
-          <w:color w:val="1E40AF"/>
-        </w:rPr>
-        <w:t xml:space="preserve">▪  </w:t>
-      </w:r>
-      <w:r>
-        <w:rPr>
-          <w:b/>
-          <w:sz w:val="19"/>
-          <w:color w:val="0F294A"/>
-        </w:rPr>
-        <w:t xml:space="preserve">DevOps Engineer (WSIB): </w:t>
+        <w:keepLines w:val="1"/>
+        <w:widowControl w:val="1"/>
+        <w:ind w:left="360" w:hanging="240"/>
+        <w:spacing w:before="0" w:after="40"/>
+      </w:pPr>
+      <w:r>
+        <w:rPr>
+          <w:sz w:val="19"/>
+          <w:color w:val="1E40AF"/>
+        </w:rPr>
+        <w:t xml:space="preserve">▪  </w:t>
+      </w:r>
+      <w:r>
+        <w:rPr>
+          <w:b/>
+          <w:sz w:val="19"/>
+          <w:color w:val="0F294A"/>
+        </w:rPr>
+        <w:t xml:space="preserve">DevOps Engineer — Client: WSIB (02/2015 – 08/2015): </w:t>
       </w:r>
       <w:r>
         <w:rPr>
@@ -1484,6 +1652,9 @@
     </w:p>
     <w:p>
       <w:pPr>
+        <w:keepNext w:val="1"/>
+        <w:keepLines w:val="1"/>
+        <w:widowControl w:val="1"/>
         <w:pBdr>
           <w:bottom w:val="single" w:sz="6" w:space="4" w:color="CBD5E1"/>
         </w:pBdr>
@@ -1500,6 +1671,8 @@
     </w:p>
     <w:p>
       <w:pPr>
+        <w:keepLines w:val="1"/>
+        <w:widowControl w:val="1"/>
         <w:tabs>
           <w:tab w:val="right" w:pos="10106"/>
         </w:tabs>
@@ -1519,14 +1692,14 @@
           <w:sz w:val="19"/>
           <w:color w:val="0F294A"/>
         </w:rPr>
-        <w:t>MIT Professional Education: Cloud &amp; DevOps — Continuous Transformation</w:t>
-      </w:r>
-      <w:r>
-        <w:rPr>
-          <w:sz w:val="19"/>
-          <w:color w:val="64748B"/>
-        </w:rPr>
-        <w:t xml:space="preserve"> — MIT</w:t>
+        <w:t>AWS Certified Solutions Architect – Associate</w:t>
+      </w:r>
+      <w:r>
+        <w:rPr>
+          <w:sz w:val="19"/>
+          <w:color w:val="64748B"/>
+        </w:rPr>
+        <w:t xml:space="preserve"> — Amazon Web Services</w:t>
       </w:r>
       <w:r>
         <w:tab/>
@@ -1536,11 +1709,13 @@
           <w:sz w:val="18"/>
           <w:color w:val="475569"/>
         </w:rPr>
-        <w:t>2020 – 2021</w:t>
-      </w:r>
-    </w:p>
-    <w:p>
-      <w:pPr>
+        <w:t>2023</w:t>
+      </w:r>
+    </w:p>
+    <w:p>
+      <w:pPr>
+        <w:keepLines w:val="1"/>
+        <w:widowControl w:val="1"/>
         <w:tabs>
           <w:tab w:val="right" w:pos="10106"/>
         </w:tabs>
@@ -1560,14 +1735,14 @@
           <w:sz w:val="19"/>
           <w:color w:val="0F294A"/>
         </w:rPr>
-        <w:t>AWS Certified Solutions Architect – Associate</w:t>
-      </w:r>
-      <w:r>
-        <w:rPr>
-          <w:sz w:val="19"/>
-          <w:color w:val="64748B"/>
-        </w:rPr>
-        <w:t xml:space="preserve"> — Amazon Web Services</w:t>
+        <w:t>MIT Professional Education: Cloud &amp; DevOps — Continuous Transformation</w:t>
+      </w:r>
+      <w:r>
+        <w:rPr>
+          <w:sz w:val="19"/>
+          <w:color w:val="64748B"/>
+        </w:rPr>
+        <w:t xml:space="preserve"> — MIT</w:t>
       </w:r>
       <w:r>
         <w:tab/>
@@ -1577,11 +1752,13 @@
           <w:sz w:val="18"/>
           <w:color w:val="475569"/>
         </w:rPr>
-        <w:t>2023</w:t>
-      </w:r>
-    </w:p>
-    <w:p>
-      <w:pPr>
+        <w:t>2020 – 2021</w:t>
+      </w:r>
+    </w:p>
+    <w:p>
+      <w:pPr>
+        <w:keepLines w:val="1"/>
+        <w:widowControl w:val="1"/>
         <w:tabs>
           <w:tab w:val="right" w:pos="10106"/>
         </w:tabs>
@@ -1601,14 +1778,14 @@
           <w:sz w:val="19"/>
           <w:color w:val="0F294A"/>
         </w:rPr>
-        <w:t>Google Cloud Certified Professional Cloud Architect</w:t>
-      </w:r>
-      <w:r>
-        <w:rPr>
-          <w:sz w:val="19"/>
-          <w:color w:val="64748B"/>
-        </w:rPr>
-        <w:t xml:space="preserve"> — Google Cloud</w:t>
+        <w:t>Google Cloud Specialization: Architecting Hybrid Cloud with Anthos</w:t>
+      </w:r>
+      <w:r>
+        <w:rPr>
+          <w:sz w:val="19"/>
+          <w:color w:val="64748B"/>
+        </w:rPr>
+        <w:t xml:space="preserve"> — Google Cloud / Coursera</w:t>
       </w:r>
       <w:r>
         <w:tab/>
@@ -1618,11 +1795,13 @@
           <w:sz w:val="18"/>
           <w:color w:val="475569"/>
         </w:rPr>
-        <w:t>2019</w:t>
-      </w:r>
-    </w:p>
-    <w:p>
-      <w:pPr>
+        <w:t>2020</w:t>
+      </w:r>
+    </w:p>
+    <w:p>
+      <w:pPr>
+        <w:keepLines w:val="1"/>
+        <w:widowControl w:val="1"/>
         <w:tabs>
           <w:tab w:val="right" w:pos="10106"/>
         </w:tabs>
@@ -1642,14 +1821,14 @@
           <w:sz w:val="19"/>
           <w:color w:val="0F294A"/>
         </w:rPr>
-        <w:t>Google Cloud Certified Associate Cloud Engineer</w:t>
-      </w:r>
-      <w:r>
-        <w:rPr>
-          <w:sz w:val="19"/>
-          <w:color w:val="64748B"/>
-        </w:rPr>
-        <w:t xml:space="preserve"> — Google Cloud</w:t>
+        <w:t>Google Cloud Specialization: Security in Google Cloud Platform</w:t>
+      </w:r>
+      <w:r>
+        <w:rPr>
+          <w:sz w:val="19"/>
+          <w:color w:val="64748B"/>
+        </w:rPr>
+        <w:t xml:space="preserve"> — Google Cloud / Coursera</w:t>
       </w:r>
       <w:r>
         <w:tab/>
@@ -1659,11 +1838,13 @@
           <w:sz w:val="18"/>
           <w:color w:val="475569"/>
         </w:rPr>
-        <w:t>2019</w:t>
-      </w:r>
-    </w:p>
-    <w:p>
-      <w:pPr>
+        <w:t>2020</w:t>
+      </w:r>
+    </w:p>
+    <w:p>
+      <w:pPr>
+        <w:keepLines w:val="1"/>
+        <w:widowControl w:val="1"/>
         <w:tabs>
           <w:tab w:val="right" w:pos="10106"/>
         </w:tabs>
@@ -1683,14 +1864,14 @@
           <w:sz w:val="19"/>
           <w:color w:val="0F294A"/>
         </w:rPr>
-        <w:t>Google Cloud Specialization: Architecting Hybrid Cloud with Anthos</w:t>
-      </w:r>
-      <w:r>
-        <w:rPr>
-          <w:sz w:val="19"/>
-          <w:color w:val="64748B"/>
-        </w:rPr>
-        <w:t xml:space="preserve"> — Google Cloud</w:t>
+        <w:t>Cloud Architecture with Google Cloud (Professional Certificate)</w:t>
+      </w:r>
+      <w:r>
+        <w:rPr>
+          <w:sz w:val="19"/>
+          <w:color w:val="64748B"/>
+        </w:rPr>
+        <w:t xml:space="preserve"> — Google Cloud / Coursera</w:t>
       </w:r>
       <w:r>
         <w:tab/>
@@ -1700,11 +1881,13 @@
           <w:sz w:val="18"/>
           <w:color w:val="475569"/>
         </w:rPr>
-        <w:t>2020</w:t>
-      </w:r>
-    </w:p>
-    <w:p>
-      <w:pPr>
+        <w:t>2019</w:t>
+      </w:r>
+    </w:p>
+    <w:p>
+      <w:pPr>
+        <w:keepLines w:val="1"/>
+        <w:widowControl w:val="1"/>
         <w:tabs>
           <w:tab w:val="right" w:pos="10106"/>
         </w:tabs>
@@ -1724,14 +1907,14 @@
           <w:sz w:val="19"/>
           <w:color w:val="0F294A"/>
         </w:rPr>
-        <w:t>Google Cloud Specialization: Security in Google Cloud Platform</w:t>
-      </w:r>
-      <w:r>
-        <w:rPr>
-          <w:sz w:val="19"/>
-          <w:color w:val="64748B"/>
-        </w:rPr>
-        <w:t xml:space="preserve"> — Google Cloud</w:t>
+        <w:t>Cloud Engineering with Google Cloud (Professional Certificate)</w:t>
+      </w:r>
+      <w:r>
+        <w:rPr>
+          <w:sz w:val="19"/>
+          <w:color w:val="64748B"/>
+        </w:rPr>
+        <w:t xml:space="preserve"> — Google Cloud / Coursera</w:t>
       </w:r>
       <w:r>
         <w:tab/>
@@ -1741,11 +1924,13 @@
           <w:sz w:val="18"/>
           <w:color w:val="475569"/>
         </w:rPr>
-        <w:t>2020</w:t>
-      </w:r>
-    </w:p>
-    <w:p>
-      <w:pPr>
+        <w:t>2019</w:t>
+      </w:r>
+    </w:p>
+    <w:p>
+      <w:pPr>
+        <w:keepLines w:val="1"/>
+        <w:widowControl w:val="1"/>
         <w:tabs>
           <w:tab w:val="right" w:pos="10106"/>
         </w:tabs>
@@ -1772,7 +1957,7 @@
           <w:sz w:val="19"/>
           <w:color w:val="64748B"/>
         </w:rPr>
-        <w:t xml:space="preserve"> — Google Cloud</w:t>
+        <w:t xml:space="preserve"> — Google Cloud / Coursera</w:t>
       </w:r>
       <w:r>
         <w:tab/>
@@ -1787,6 +1972,8 @@
     </w:p>
     <w:p>
       <w:pPr>
+        <w:keepLines w:val="1"/>
+        <w:widowControl w:val="1"/>
         <w:tabs>
           <w:tab w:val="right" w:pos="10106"/>
         </w:tabs>
@@ -1806,14 +1993,14 @@
           <w:sz w:val="19"/>
           <w:color w:val="0F294A"/>
         </w:rPr>
-        <w:t>Google Certified Kubernetes Architect Specialization</w:t>
-      </w:r>
-      <w:r>
-        <w:rPr>
-          <w:sz w:val="19"/>
-          <w:color w:val="64748B"/>
-        </w:rPr>
-        <w:t xml:space="preserve"> — Google Cloud</w:t>
+        <w:t>Kubernetes Architecture in Google Cloud Specialization</w:t>
+      </w:r>
+      <w:r>
+        <w:rPr>
+          <w:sz w:val="19"/>
+          <w:color w:val="64748B"/>
+        </w:rPr>
+        <w:t xml:space="preserve"> — Google Cloud / Coursera</w:t>
       </w:r>
       <w:r>
         <w:tab/>
@@ -1828,6 +2015,8 @@
     </w:p>
     <w:p>
       <w:pPr>
+        <w:keepLines w:val="1"/>
+        <w:widowControl w:val="1"/>
         <w:tabs>
           <w:tab w:val="right" w:pos="10106"/>
         </w:tabs>
@@ -1847,14 +2036,14 @@
           <w:sz w:val="19"/>
           <w:color w:val="0F294A"/>
         </w:rPr>
-        <w:t>Linux Networking Administration Certification</w:t>
-      </w:r>
-      <w:r>
-        <w:rPr>
-          <w:sz w:val="19"/>
-          <w:color w:val="64748B"/>
-        </w:rPr>
-        <w:t xml:space="preserve"> — Linux Centre</w:t>
+        <w:t>IBM SoftLayer Fundamentals Certification</w:t>
+      </w:r>
+      <w:r>
+        <w:rPr>
+          <w:sz w:val="19"/>
+          <w:color w:val="64748B"/>
+        </w:rPr>
+        <w:t xml:space="preserve"> — IBM</w:t>
       </w:r>
       <w:r>
         <w:tab/>
@@ -1864,11 +2053,13 @@
           <w:sz w:val="18"/>
           <w:color w:val="475569"/>
         </w:rPr>
-        <w:t>2013</w:t>
-      </w:r>
-    </w:p>
-    <w:p>
-      <w:pPr>
+        <w:t>2016</w:t>
+      </w:r>
+    </w:p>
+    <w:p>
+      <w:pPr>
+        <w:keepLines w:val="1"/>
+        <w:widowControl w:val="1"/>
         <w:tabs>
           <w:tab w:val="right" w:pos="10106"/>
         </w:tabs>
@@ -1910,6 +2101,51 @@
     </w:p>
     <w:p>
       <w:pPr>
+        <w:keepLines w:val="1"/>
+        <w:widowControl w:val="1"/>
+        <w:tabs>
+          <w:tab w:val="right" w:pos="10106"/>
+        </w:tabs>
+        <w:ind w:left="240" w:hanging="240"/>
+        <w:spacing w:before="20" w:after="30"/>
+      </w:pPr>
+      <w:r>
+        <w:rPr>
+          <w:sz w:val="19"/>
+          <w:color w:val="1E40AF"/>
+        </w:rPr>
+        <w:t xml:space="preserve">• </w:t>
+      </w:r>
+      <w:r>
+        <w:rPr>
+          <w:b/>
+          <w:sz w:val="19"/>
+          <w:color w:val="0F294A"/>
+        </w:rPr>
+        <w:t>Linux Networking Administration Certification</w:t>
+      </w:r>
+      <w:r>
+        <w:rPr>
+          <w:sz w:val="19"/>
+          <w:color w:val="64748B"/>
+        </w:rPr>
+        <w:t xml:space="preserve"> — Linux Centre</w:t>
+      </w:r>
+      <w:r>
+        <w:tab/>
+      </w:r>
+      <w:r>
+        <w:rPr>
+          <w:sz w:val="18"/>
+          <w:color w:val="475569"/>
+        </w:rPr>
+        <w:t>2013</w:t>
+      </w:r>
+    </w:p>
+    <w:p>
+      <w:pPr>
+        <w:keepLines w:val="1"/>
+        <w:widowControl w:val="1"/>
         <w:tabs>
           <w:tab w:val="right" w:pos="10106"/>
         </w:tabs>

</xml_diff>

<commit_message>
Update Tele2 experience bullets
</commit_message>
<xml_diff>
--- a/MGarcia_CV_Redesigned_2026.docx
+++ b/MGarcia_CV_Redesigned_2026.docx
@@ -1085,75 +1085,137 @@
           <w:sz w:val="19"/>
           <w:color w:val="0F294A"/>
         </w:rPr>
-        <w:t xml:space="preserve">DevOps Chapter Leadership: </w:t>
-      </w:r>
-      <w:r>
-        <w:rPr>
-          <w:sz w:val="19"/>
-          <w:color w:val="334155"/>
-        </w:rPr>
-        <w:t>Led the DevOps and SRE chapter, establishing technical competency matrices, learning plans, and a blameless team culture supporting experimentation and continuous learning.</w:t>
-      </w:r>
-    </w:p>
-    <w:p>
-      <w:pPr>
-        <w:keepNext w:val="1"/>
-        <w:keepLines w:val="1"/>
-        <w:widowControl w:val="1"/>
-        <w:ind w:left="360" w:hanging="240"/>
-        <w:spacing w:before="0" w:after="40"/>
-      </w:pPr>
-      <w:r>
-        <w:rPr>
-          <w:sz w:val="19"/>
-          <w:color w:val="1E40AF"/>
-        </w:rPr>
-        <w:t xml:space="preserve">▪  </w:t>
-      </w:r>
-      <w:r>
-        <w:rPr>
-          <w:b/>
-          <w:sz w:val="19"/>
-          <w:color w:val="0F294A"/>
-        </w:rPr>
-        <w:t xml:space="preserve">Multi-Cloud Delivery Automation: </w:t>
-      </w:r>
-      <w:r>
-        <w:rPr>
-          <w:sz w:val="19"/>
-          <w:color w:val="334155"/>
-        </w:rPr>
-        <w:t>Architected continuous delivery pipelines for Google Cloud and Azure platforms utilizing GoCDK and Ansible.</w:t>
-      </w:r>
-    </w:p>
-    <w:p>
-      <w:pPr>
-        <w:keepLines w:val="1"/>
-        <w:widowControl w:val="1"/>
-        <w:ind w:left="360" w:hanging="240"/>
-        <w:spacing w:before="0" w:after="40"/>
-      </w:pPr>
-      <w:r>
-        <w:rPr>
-          <w:sz w:val="19"/>
-          <w:color w:val="1E40AF"/>
-        </w:rPr>
-        <w:t xml:space="preserve">▪  </w:t>
-      </w:r>
-      <w:r>
-        <w:rPr>
-          <w:b/>
-          <w:sz w:val="19"/>
-          <w:color w:val="0F294A"/>
-        </w:rPr>
-        <w:t xml:space="preserve">Windows &amp; Azure Infrastructure Automation: </w:t>
-      </w:r>
-      <w:r>
-        <w:rPr>
-          <w:sz w:val="19"/>
-          <w:color w:val="334155"/>
-        </w:rPr>
-        <w:t>Eliminated manual operational errors by developing resilient PowerShell automation frameworks for enterprise Windows environments; deployed Azure DevOps monitoring dashboards.</w:t>
+        <w:t xml:space="preserve">Azure DevOps &amp; Cloud Platform: </w:t>
+      </w:r>
+      <w:r>
+        <w:rPr>
+          <w:sz w:val="19"/>
+          <w:color w:val="334155"/>
+        </w:rPr>
+        <w:t>Managed Azure DevOps platform and supported cloud-based application environments.</w:t>
+      </w:r>
+    </w:p>
+    <w:p>
+      <w:pPr>
+        <w:keepNext w:val="1"/>
+        <w:keepLines w:val="1"/>
+        <w:widowControl w:val="1"/>
+        <w:ind w:left="360" w:hanging="240"/>
+        <w:spacing w:before="0" w:after="40"/>
+      </w:pPr>
+      <w:r>
+        <w:rPr>
+          <w:sz w:val="19"/>
+          <w:color w:val="1E40AF"/>
+        </w:rPr>
+        <w:t xml:space="preserve">▪  </w:t>
+      </w:r>
+      <w:r>
+        <w:rPr>
+          <w:b/>
+          <w:sz w:val="19"/>
+          <w:color w:val="0F294A"/>
+        </w:rPr>
+        <w:t xml:space="preserve">Monitoring &amp; Operational Visibility: </w:t>
+      </w:r>
+      <w:r>
+        <w:rPr>
+          <w:sz w:val="19"/>
+          <w:color w:val="334155"/>
+        </w:rPr>
+        <w:t>Implemented monitoring solutions and dashboards to improve visibility and operational awareness.</w:t>
+      </w:r>
+    </w:p>
+    <w:p>
+      <w:pPr>
+        <w:keepNext w:val="1"/>
+        <w:keepLines w:val="1"/>
+        <w:widowControl w:val="1"/>
+        <w:ind w:left="360" w:hanging="240"/>
+        <w:spacing w:before="0" w:after="40"/>
+      </w:pPr>
+      <w:r>
+        <w:rPr>
+          <w:sz w:val="19"/>
+          <w:color w:val="1E40AF"/>
+        </w:rPr>
+        <w:t xml:space="preserve">▪  </w:t>
+      </w:r>
+      <w:r>
+        <w:rPr>
+          <w:b/>
+          <w:sz w:val="19"/>
+          <w:color w:val="0F294A"/>
+        </w:rPr>
+        <w:t xml:space="preserve">PowerShell &amp; Windows Automation: </w:t>
+      </w:r>
+      <w:r>
+        <w:rPr>
+          <w:sz w:val="19"/>
+          <w:color w:val="334155"/>
+        </w:rPr>
+        <w:t>Automated operational processes using PowerShell, reducing manual intervention and minimizing human error in Windows environments.</w:t>
+      </w:r>
+    </w:p>
+    <w:p>
+      <w:pPr>
+        <w:keepNext w:val="1"/>
+        <w:keepLines w:val="1"/>
+        <w:widowControl w:val="1"/>
+        <w:ind w:left="360" w:hanging="240"/>
+        <w:spacing w:before="0" w:after="40"/>
+      </w:pPr>
+      <w:r>
+        <w:rPr>
+          <w:sz w:val="19"/>
+          <w:color w:val="1E40AF"/>
+        </w:rPr>
+        <w:t xml:space="preserve">▪  </w:t>
+      </w:r>
+      <w:r>
+        <w:rPr>
+          <w:b/>
+          <w:sz w:val="19"/>
+          <w:color w:val="0F294A"/>
+        </w:rPr>
+        <w:t xml:space="preserve">Platform Reliability &amp; Risk Mitigation: </w:t>
+      </w:r>
+      <w:r>
+        <w:rPr>
+          <w:sz w:val="19"/>
+          <w:color w:val="334155"/>
+        </w:rPr>
+        <w:t>Contributed to planning and risk mitigation strategies for platform reliability.</w:t>
+      </w:r>
+    </w:p>
+    <w:p>
+      <w:pPr>
+        <w:keepLines w:val="1"/>
+        <w:widowControl w:val="1"/>
+        <w:ind w:left="360" w:hanging="240"/>
+        <w:spacing w:before="0" w:after="40"/>
+      </w:pPr>
+      <w:r>
+        <w:rPr>
+          <w:sz w:val="19"/>
+          <w:color w:val="1E40AF"/>
+        </w:rPr>
+        <w:t xml:space="preserve">▪  </w:t>
+      </w:r>
+      <w:r>
+        <w:rPr>
+          <w:b/>
+          <w:sz w:val="19"/>
+          <w:color w:val="0F294A"/>
+        </w:rPr>
+        <w:t xml:space="preserve">Technical Mentorship: </w:t>
+      </w:r>
+      <w:r>
+        <w:rPr>
+          <w:sz w:val="19"/>
+          <w:color w:val="334155"/>
+        </w:rPr>
+        <w:t>Mentored team members and supported knowledge sharing.</w:t>
       </w:r>
     </w:p>
     <w:p>

</xml_diff>

<commit_message>
Add networking & identity tools: FreeIPA, Keycloak, NetBox, WireGuard, Cilium, Envoy
</commit_message>
<xml_diff>
--- a/MGarcia_CV_Redesigned_2026.docx
+++ b/MGarcia_CV_Redesigned_2026.docx
@@ -190,7 +190,7 @@
           <w:sz w:val="19"/>
           <w:color w:val="334155"/>
         </w:rPr>
-        <w:t>OpenTelemetry (OTel), Prometheus, Grafana, Loki, Datadog (APM &amp; Dashboards), ELK Stack (Elasticsearch, Logstash, Kibana), Fluent Bit, Vector, New Relic, Splunk</w:t>
+        <w:t>OpenTelemetry (OTel), Prometheus, Grafana, Loki, Datadog (APM &amp; Dashboards), ELK Stack (Elasticsearch, Logstash, Kibana), Fluent Bit, New Relic, Splunk</w:t>
       </w:r>
     </w:p>
     <w:p>
@@ -206,14 +206,37 @@
           <w:sz w:val="19"/>
           <w:color w:val="0F294A"/>
         </w:rPr>
-        <w:t xml:space="preserve">• Security, Identity &amp; Networking: </w:t>
-      </w:r>
-      <w:r>
-        <w:rPr>
-          <w:sz w:val="19"/>
-          <w:color w:val="334155"/>
-        </w:rPr>
-        <w:t>HashiCorp Vault, CyberArk Conjur, External Secrets Operator, OIDC &amp; OAuth 2.0, AWS WAF &amp; Shield, Apigee API Gateway, mTLS, Nginx, Linux Network Admin</w:t>
+        <w:t xml:space="preserve">• Security &amp; Identity: </w:t>
+      </w:r>
+      <w:r>
+        <w:rPr>
+          <w:sz w:val="19"/>
+          <w:color w:val="334155"/>
+        </w:rPr>
+        <w:t>HashiCorp Vault, CyberArk Conjur, Keycloak, FreeIPA, External Secrets Operator, OIDC &amp; OAuth 2.0, mTLS, AWS WAF &amp; Shield, Apigee API Gateway</w:t>
+      </w:r>
+    </w:p>
+    <w:p>
+      <w:pPr>
+        <w:keepLines w:val="1"/>
+        <w:widowControl w:val="1"/>
+        <w:ind w:left="240" w:hanging="240"/>
+        <w:spacing w:before="20" w:after="40"/>
+      </w:pPr>
+      <w:r>
+        <w:rPr>
+          <w:b/>
+          <w:sz w:val="19"/>
+          <w:color w:val="0F294A"/>
+        </w:rPr>
+        <w:t xml:space="preserve">• Networking &amp; Traffic Engineering: </w:t>
+      </w:r>
+      <w:r>
+        <w:rPr>
+          <w:sz w:val="19"/>
+          <w:color w:val="334155"/>
+        </w:rPr>
+        <w:t>Cilium, Calico (CNI), Envoy Proxy, Istio Service Mesh, NetBox (IPAM/DCIM), WireGuard, OpenVPN, Traefik, HAProxy, Nginx, AWS Transit Gateway, Direct Connect, Cloud Interconnect, VPC Peering, BGP, Cloudflare, CoreDNS, Wireshark, tcpdump, iperf, Linux Network Admin</w:t>
       </w:r>
     </w:p>
     <w:p>

</xml_diff>

<commit_message>
Add verified tool versions to experience sections and update CV artifacts
</commit_message>
<xml_diff>
--- a/MGarcia_CV_Redesigned_2026.docx
+++ b/MGarcia_CV_Redesigned_2026.docx
@@ -384,7 +384,7 @@
           <w:sz w:val="19"/>
           <w:color w:val="334155"/>
         </w:rPr>
-        <w:t>Designed a Terraform-based Amazon EKS platform using EKS Pod Identity, Karpenter Spot autoscaling, and ArgoCD with automated synchronization, self-healing, and pruning.</w:t>
+        <w:t>Designed a Terraform-based Amazon EKS (Kubernetes 1.30+) platform using native EKS Pod Identity, Karpenter (v1.x) Spot autoscaling, and ArgoCD with automated synchronization, self-healing, and pruning.</w:t>
       </w:r>
     </w:p>
     <w:p>
@@ -507,7 +507,7 @@
           <w:sz w:val="19"/>
           <w:color w:val="334155"/>
         </w:rPr>
-        <w:t>Built Python (FastAPI) microservices and an agentic logistics system using LangChain and Azure OpenAI to assign cargo to vessels based on dimensions, routes, and priorities, deployed on Azure Kubernetes Service (AKS); evaluated local LLM runtimes (Ollama, Qwen, DeepSeek) with LangSmith tracing.</w:t>
+        <w:t>Built Python 3.12 (FastAPI) microservices and an agentic logistics system using LangChain and Azure OpenAI to assign cargo to vessels based on dimensions, routes, and priorities, deployed on Azure Kubernetes Service (AKS); evaluated local LLM runtimes (DeepSeek-R1, Qwen 2.5) via Ollama with LangSmith tracing.</w:t>
       </w:r>
     </w:p>
     <w:p>
@@ -590,7 +590,7 @@
           <w:sz w:val="19"/>
           <w:color w:val="334155"/>
         </w:rPr>
-        <w:t>Spearheaded multi-tier AWS cost reduction strategies; implemented Compute Savings Plans and RDS Reserved Instances, replaced AWS Transfer Family with self-managed SFTP on EC2, and transitioned ElastiCache Redis to Valkey, generating substantial recurring cloud savings.</w:t>
+        <w:t>Spearheaded multi-tier AWS cost reduction strategies; implemented Compute Savings Plans and RDS Reserved Instances, replaced AWS Transfer Family with self-managed SFTP on EC2, and transitioned from ElastiCache Redis 7 to Valkey 7.2, generating substantial recurring cloud savings.</w:t>
       </w:r>
     </w:p>
     <w:p>
@@ -621,7 +621,7 @@
           <w:sz w:val="19"/>
           <w:color w:val="334155"/>
         </w:rPr>
-        <w:t>Eliminated redundant CloudWatch log ingestion expenses by redesigning log pipelines to route exclusively via Promtail and Loki into centralized Grafana dashboards.</w:t>
+        <w:t>Eliminated redundant CloudWatch log ingestion expenses by redesigning log pipelines to route exclusively via Promtail and Loki 3.0 into centralized Grafana dashboards.</w:t>
       </w:r>
     </w:p>
     <w:p>
@@ -765,7 +765,7 @@
           <w:sz w:val="19"/>
           <w:color w:val="334155"/>
         </w:rPr>
-        <w:t>Delivered a cloud migration against a tight 3-month deadline from on-premises Docker Swarm to AWS, migrating approximately 50 Java microservices to Amazon EKS and approximately 15 distributed stateful platforms (Kafka, ZooKeeper, RabbitMQ, MongoDB, MSSQL) to EC2 and RDS.</w:t>
+        <w:t>Delivered a cloud migration against a tight 3-month deadline from on-premises Docker Swarm to AWS, migrating approximately 50 Java microservices (Java 11/17 LTS, Spring Boot 2.7/3.x, Payara 5/6) to Amazon EKS (Kubernetes 1.25–1.28) and approximately 15 distributed stateful platforms (Kafka, ZooKeeper, RabbitMQ, MongoDB, MSSQL) to EC2 and RDS.</w:t>
       </w:r>
     </w:p>
     <w:p>
@@ -857,7 +857,7 @@
           <w:sz w:val="19"/>
           <w:color w:val="334155"/>
         </w:rPr>
-        <w:t>Automated infrastructure provisioning using Terraform and AWS CDK with Go; integrated Datadog and ELK Stack monitoring across migrated workloads, and orchestrated MongoDB and MSSQL cutovers to AWS RDS.</w:t>
+        <w:t>Automated infrastructure provisioning using Terraform 1.x and AWS CDK v2 with Go; integrated Datadog and ELK Stack monitoring across migrated workloads, and orchestrated MongoDB and MSSQL cutovers to AWS RDS.</w:t>
       </w:r>
     </w:p>
     <w:p>
@@ -971,7 +971,7 @@
           <w:sz w:val="19"/>
           <w:color w:val="334155"/>
         </w:rPr>
-        <w:t>Implemented Apache Kafka streaming pipelines utilizing custom Google Cloud Dataflow Flex Templates to stream real-time events into BigQuery and Pub/Sub.</w:t>
+        <w:t>Implemented Apache Kafka (v2.8/3.x) streaming pipelines utilizing custom Google Cloud Dataflow Flex Templates to stream real-time events into BigQuery and Pub/Sub.</w:t>
       </w:r>
     </w:p>
     <w:p>
@@ -1002,7 +1002,7 @@
           <w:sz w:val="19"/>
           <w:color w:val="334155"/>
         </w:rPr>
-        <w:t>Developed two proofs of concept, one on Google Cloud Platform (GCP) and another on Azure Kubernetes Service (AKS), to test HashiCorp Vault secrets management across multi-cloud environments.</w:t>
+        <w:t>Developed two proofs of concept, one on Google Cloud Platform (GCP) and another on Azure Kubernetes Service (AKS), to test HashiCorp Vault (v1.8+) secrets management across multi-cloud environments.</w:t>
       </w:r>
     </w:p>
     <w:p>
@@ -1177,7 +1177,7 @@
           <w:sz w:val="19"/>
           <w:color w:val="334155"/>
         </w:rPr>
-        <w:t>Automated operational processes using PowerShell, reducing manual intervention and minimizing human error in Windows environments.</w:t>
+        <w:t>Automated operational processes using PowerShell 7 and 5.1, reducing manual intervention and minimizing human error across enterprise Windows Server 2019 environments.</w:t>
       </w:r>
     </w:p>
     <w:p>
@@ -1382,7 +1382,7 @@
           <w:sz w:val="19"/>
           <w:color w:val="334155"/>
         </w:rPr>
-        <w:t>Engineered and managed resilient, highly available Kubernetes clusters in AWS Canada Central using kOps with least-privilege IAM security controls prior to regional EKS availability.</w:t>
+        <w:t>Engineered and managed resilient, highly available Kubernetes (v1.14/1.15) clusters in AWS Canada Central using kOps with least-privilege IAM security controls prior to regional EKS availability.</w:t>
       </w:r>
     </w:p>
     <w:p>
@@ -1496,7 +1496,7 @@
           <w:sz w:val="19"/>
           <w:color w:val="334155"/>
         </w:rPr>
-        <w:t>Reduced environment provisioning lead-time from 4 hours to 6 minutes (97.5% reduction) via Jenkins automation pipelines and AWS CLI scripting, eliminating human deployment errors.</w:t>
+        <w:t>Reduced environment provisioning lead-time from 4 hours to 6 minutes (97.5% reduction) via Jenkins 2.x automation pipelines and AWS CLI scripting, eliminating human deployment errors.</w:t>
       </w:r>
     </w:p>
     <w:p>
@@ -1588,7 +1588,7 @@
           <w:sz w:val="19"/>
           <w:color w:val="334155"/>
         </w:rPr>
-        <w:t>Worked on MLOps workflows using Amazon SageMaker and Kubeflow components.</w:t>
+        <w:t>Worked on MLOps workflows using Amazon SageMaker and Kubeflow (v0.3/0.4) components.</w:t>
       </w:r>
     </w:p>
     <w:p>
@@ -1671,7 +1671,7 @@
           <w:sz w:val="19"/>
           <w:color w:val="334155"/>
         </w:rPr>
-        <w:t>Cut deployment cycles by 30% and AWS costs by 20%; engineered CI pipelines with XL-Release, Jenkins, and Docker; built streaming data transformations with Kafka, Flink, and Apache Spark.</w:t>
+        <w:t>Cut deployment cycles by 30% and AWS costs by 20%; engineered CI pipelines with XL-Release, Jenkins, and Docker (v1.12+); built streaming data transformations with Apache Kafka (0.10/0.11), Apache Flink 1.x, and Apache Spark 2.x.</w:t>
       </w:r>
     </w:p>
     <w:p>
@@ -1702,7 +1702,7 @@
           <w:sz w:val="19"/>
           <w:color w:val="334155"/>
         </w:rPr>
-        <w:t>Built automated Kafka data streaming platforms; automated deployment and server provisioning using Ansible, SaltStack, and Python; established HashiCorp Vault encryption for sensitive data.</w:t>
+        <w:t>Built automated Kafka data streaming platforms; automated deployment and server provisioning using Ansible 2.x, SaltStack, and Python; established HashiCorp Vault encryption for sensitive data.</w:t>
       </w:r>
     </w:p>
     <w:p>

</xml_diff>

<commit_message>
Add internal AI agent platform, AI-driven CI/CD gates, and LLM observability to Taina experience
</commit_message>
<xml_diff>
--- a/MGarcia_CV_Redesigned_2026.docx
+++ b/MGarcia_CV_Redesigned_2026.docx
@@ -482,6 +482,99 @@
     </w:p>
     <w:p>
       <w:pPr>
+        <w:keepNext w:val="1"/>
+        <w:keepLines w:val="1"/>
+        <w:widowControl w:val="1"/>
+        <w:ind w:left="360" w:hanging="240"/>
+        <w:spacing w:before="0" w:after="40"/>
+      </w:pPr>
+      <w:r>
+        <w:rPr>
+          <w:sz w:val="19"/>
+          <w:color w:val="1E40AF"/>
+        </w:rPr>
+        <w:t xml:space="preserve">▪  </w:t>
+      </w:r>
+      <w:r>
+        <w:rPr>
+          <w:b/>
+          <w:sz w:val="19"/>
+          <w:color w:val="0F294A"/>
+        </w:rPr>
+        <w:t xml:space="preserve">Internal AI Agent Platform (~30 Agents): </w:t>
+      </w:r>
+      <w:r>
+        <w:rPr>
+          <w:sz w:val="19"/>
+          <w:color w:val="334155"/>
+        </w:rPr>
+        <w:t>Architected and deployed an internal platform hosting approximately 30 autonomous AI agents adopted across engineering teams; automated operational workflows, incident triage, and cluster operations through deep integrations with Jira APIs and Kubernetes.</w:t>
+      </w:r>
+    </w:p>
+    <w:p>
+      <w:pPr>
+        <w:keepNext w:val="1"/>
+        <w:keepLines w:val="1"/>
+        <w:widowControl w:val="1"/>
+        <w:ind w:left="360" w:hanging="240"/>
+        <w:spacing w:before="0" w:after="40"/>
+      </w:pPr>
+      <w:r>
+        <w:rPr>
+          <w:sz w:val="19"/>
+          <w:color w:val="1E40AF"/>
+        </w:rPr>
+        <w:t xml:space="preserve">▪  </w:t>
+      </w:r>
+      <w:r>
+        <w:rPr>
+          <w:b/>
+          <w:sz w:val="19"/>
+          <w:color w:val="0F294A"/>
+        </w:rPr>
+        <w:t xml:space="preserve">AI-Driven CI/CD &amp; Security Gates: </w:t>
+      </w:r>
+      <w:r>
+        <w:rPr>
+          <w:sz w:val="19"/>
+          <w:color w:val="334155"/>
+        </w:rPr>
+        <w:t>Implemented AI-augmented CI/CD delivery pipelines incorporating model API validations, automated quality gates, and Retrieval-Augmented Generation (RAG); enforced strict security policies, deterministic guardrails, and approval gates to govern automated deployments.</w:t>
+      </w:r>
+    </w:p>
+    <w:p>
+      <w:pPr>
+        <w:keepNext w:val="1"/>
+        <w:keepLines w:val="1"/>
+        <w:widowControl w:val="1"/>
+        <w:ind w:left="360" w:hanging="240"/>
+        <w:spacing w:before="0" w:after="40"/>
+      </w:pPr>
+      <w:r>
+        <w:rPr>
+          <w:sz w:val="19"/>
+          <w:color w:val="1E40AF"/>
+        </w:rPr>
+        <w:t xml:space="preserve">▪  </w:t>
+      </w:r>
+      <w:r>
+        <w:rPr>
+          <w:b/>
+          <w:sz w:val="19"/>
+          <w:color w:val="0F294A"/>
+        </w:rPr>
+        <w:t xml:space="preserve">LLM Observability &amp; Telemetry: </w:t>
+      </w:r>
+      <w:r>
+        <w:rPr>
+          <w:sz w:val="19"/>
+          <w:color w:val="334155"/>
+        </w:rPr>
+        <w:t>Established comprehensive end-to-end LLM observability using LangSmith and OpenTelemetry correlated with APM and RUM metrics to monitor token consumption, inference latency, agent invocation traces, and application reliability.</w:t>
+      </w:r>
+    </w:p>
+    <w:p>
+      <w:pPr>
         <w:keepLines w:val="1"/>
         <w:widowControl w:val="1"/>
         <w:ind w:left="360" w:hanging="240"/>
@@ -507,7 +600,7 @@
           <w:sz w:val="19"/>
           <w:color w:val="334155"/>
         </w:rPr>
-        <w:t>Built Python 3.12 (FastAPI) microservices and an agentic logistics system using LangChain and Azure OpenAI to assign cargo to vessels based on dimensions, routes, and priorities, deployed on Azure Kubernetes Service (AKS); evaluated local LLM runtimes (DeepSeek-R1, Qwen 2.5) via Ollama with LangSmith tracing.</w:t>
+        <w:t>Built Python 3.12 (FastAPI) microservices and an agentic logistics system using LangChain and Azure OpenAI to assign cargo to vessels based on dimensions, routes, and priorities, deployed on Azure Kubernetes Service (AKS); evaluated local LLM runtimes (DeepSeek-R1, Qwen 2.5) via Ollama.</w:t>
       </w:r>
     </w:p>
     <w:p>

</xml_diff>

<commit_message>
Group Swedish work under Contractor Independent with client assignments
</commit_message>
<xml_diff>
--- a/MGarcia_CV_Redesigned_2026.docx
+++ b/MGarcia_CV_Redesigned_2026.docx
@@ -619,7 +619,7 @@
           <w:sz w:val="21"/>
           <w:color w:val="0F294A"/>
         </w:rPr>
-        <w:t>Senior DevOps Engineer (Contract)</w:t>
+        <w:t>Senior DevOps &amp; SRE Consultant</w:t>
       </w:r>
       <w:r>
         <w:rPr>
@@ -634,7 +634,7 @@
           <w:sz w:val="20"/>
           <w:color w:val="1E40AF"/>
         </w:rPr>
-        <w:t>FirstVet</w:t>
+        <w:t>Contractor Independent</w:t>
       </w:r>
       <w:r>
         <w:tab/>
@@ -645,137 +645,14 @@
           <w:sz w:val="19"/>
           <w:color w:val="334155"/>
         </w:rPr>
-        <w:t>05/2024 – 12/2024</w:t>
+        <w:t>07/2020 – 12/2024</w:t>
       </w:r>
       <w:r>
         <w:rPr>
           <w:sz w:val="18"/>
           <w:color w:val="64748B"/>
         </w:rPr>
-        <w:t xml:space="preserve"> (Remote / Stockholm, Sweden)</w:t>
-      </w:r>
-    </w:p>
-    <w:p>
-      <w:pPr>
-        <w:keepNext w:val="1"/>
-        <w:keepLines w:val="1"/>
-        <w:widowControl w:val="1"/>
-        <w:ind w:left="360" w:hanging="240"/>
-        <w:spacing w:before="0" w:after="40"/>
-      </w:pPr>
-      <w:r>
-        <w:rPr>
-          <w:sz w:val="19"/>
-          <w:color w:val="1E40AF"/>
-        </w:rPr>
-        <w:t xml:space="preserve">▪  </w:t>
-      </w:r>
-      <w:r>
-        <w:rPr>
-          <w:b/>
-          <w:sz w:val="19"/>
-          <w:color w:val="0F294A"/>
-        </w:rPr>
-        <w:t xml:space="preserve">Aggressive Cloud Cost Optimization: </w:t>
-      </w:r>
-      <w:r>
-        <w:rPr>
-          <w:sz w:val="19"/>
-          <w:color w:val="334155"/>
-        </w:rPr>
-        <w:t>Spearheaded multi-tier AWS cost reduction strategies; implemented Compute Savings Plans and RDS Reserved Instances, replaced AWS Transfer Family with self-managed SFTP on EC2, and transitioned from ElastiCache Redis 7 to Valkey 7.2, generating substantial recurring cloud savings.</w:t>
-      </w:r>
-    </w:p>
-    <w:p>
-      <w:pPr>
-        <w:keepNext w:val="1"/>
-        <w:keepLines w:val="1"/>
-        <w:widowControl w:val="1"/>
-        <w:ind w:left="360" w:hanging="240"/>
-        <w:spacing w:before="0" w:after="40"/>
-      </w:pPr>
-      <w:r>
-        <w:rPr>
-          <w:sz w:val="19"/>
-          <w:color w:val="1E40AF"/>
-        </w:rPr>
-        <w:t xml:space="preserve">▪  </w:t>
-      </w:r>
-      <w:r>
-        <w:rPr>
-          <w:b/>
-          <w:sz w:val="19"/>
-          <w:color w:val="0F294A"/>
-        </w:rPr>
-        <w:t xml:space="preserve">Logging Architecture Revamp: </w:t>
-      </w:r>
-      <w:r>
-        <w:rPr>
-          <w:sz w:val="19"/>
-          <w:color w:val="334155"/>
-        </w:rPr>
-        <w:t>Eliminated redundant CloudWatch log ingestion expenses by redesigning log pipelines to route exclusively via Promtail and Loki 3.0 into centralized Grafana dashboards.</w:t>
-      </w:r>
-    </w:p>
-    <w:p>
-      <w:pPr>
-        <w:keepNext w:val="1"/>
-        <w:keepLines w:val="1"/>
-        <w:widowControl w:val="1"/>
-        <w:ind w:left="360" w:hanging="240"/>
-        <w:spacing w:before="0" w:after="40"/>
-      </w:pPr>
-      <w:r>
-        <w:rPr>
-          <w:sz w:val="19"/>
-          <w:color w:val="1E40AF"/>
-        </w:rPr>
-        <w:t xml:space="preserve">▪  </w:t>
-      </w:r>
-      <w:r>
-        <w:rPr>
-          <w:b/>
-          <w:sz w:val="19"/>
-          <w:color w:val="0F294A"/>
-        </w:rPr>
-        <w:t xml:space="preserve">Unified Observability &amp; FinOps Alerts: </w:t>
-      </w:r>
-      <w:r>
-        <w:rPr>
-          <w:sz w:val="19"/>
-          <w:color w:val="334155"/>
-        </w:rPr>
-        <w:t>Built comprehensive Grafana, Loki, Prometheus, and OpenTelemetry observability stacks with custom FinOps cost-allocation dashboards and real-time AWS Billing anomaly alerts.</w:t>
-      </w:r>
-    </w:p>
-    <w:p>
-      <w:pPr>
-        <w:keepLines w:val="1"/>
-        <w:widowControl w:val="1"/>
-        <w:ind w:left="360" w:hanging="240"/>
-        <w:spacing w:before="0" w:after="40"/>
-      </w:pPr>
-      <w:r>
-        <w:rPr>
-          <w:sz w:val="19"/>
-          <w:color w:val="1E40AF"/>
-        </w:rPr>
-        <w:t xml:space="preserve">▪  </w:t>
-      </w:r>
-      <w:r>
-        <w:rPr>
-          <w:b/>
-          <w:sz w:val="19"/>
-          <w:color w:val="0F294A"/>
-        </w:rPr>
-        <w:t xml:space="preserve">Infrastructure Automation: </w:t>
-      </w:r>
-      <w:r>
-        <w:rPr>
-          <w:sz w:val="19"/>
-          <w:color w:val="334155"/>
-        </w:rPr>
-        <w:t>Managed and provisioned Amazon ECS clusters and cloud networking resources with Pulumi and TypeScript.</w:t>
+        <w:t xml:space="preserve"> (Stockholm, Sweden)</w:t>
       </w:r>
     </w:p>
     <w:p>
@@ -786,30 +663,22 @@
         <w:tabs>
           <w:tab w:val="right" w:pos="10106"/>
         </w:tabs>
-        <w:spacing w:before="120" w:after="20"/>
-      </w:pPr>
-      <w:r>
-        <w:rPr>
-          <w:b/>
-          <w:sz w:val="21"/>
-          <w:color w:val="0F294A"/>
-        </w:rPr>
-        <w:t>Senior SRE &amp; DevOps Consultant (Expertake)</w:t>
-      </w:r>
-      <w:r>
-        <w:rPr>
+        <w:spacing w:before="90" w:after="20"/>
+      </w:pPr>
+      <w:r>
+        <w:rPr>
+          <w:b/>
           <w:sz w:val="20"/>
-          <w:color w:val="64748B"/>
-        </w:rPr>
-        <w:t xml:space="preserve"> | </w:t>
-      </w:r>
-      <w:r>
-        <w:rPr>
-          <w:b/>
-          <w:sz w:val="20"/>
-          <w:color w:val="1E40AF"/>
-        </w:rPr>
-        <w:t>Client: Arelion</w:t>
+          <w:color w:val="1E40AF"/>
+        </w:rPr>
+        <w:t>Assignment: FirstVet</w:t>
+      </w:r>
+      <w:r>
+        <w:rPr>
+          <w:sz w:val="19"/>
+          <w:color w:val="64748B"/>
+        </w:rPr>
+        <w:t xml:space="preserve"> — Senior DevOps Engineer (Contract)</w:t>
       </w:r>
       <w:r>
         <w:tab/>
@@ -817,140 +686,134 @@
       <w:r>
         <w:rPr>
           <w:b/>
-          <w:sz w:val="19"/>
-          <w:color w:val="334155"/>
-        </w:rPr>
-        <w:t>09/2022 – 05/2024</w:t>
-      </w:r>
-      <w:r>
-        <w:rPr>
           <w:sz w:val="18"/>
-          <w:color w:val="64748B"/>
-        </w:rPr>
-        <w:t xml:space="preserve"> (Stockholm, Sweden)</w:t>
-      </w:r>
-    </w:p>
-    <w:p>
-      <w:pPr>
-        <w:keepNext w:val="1"/>
-        <w:keepLines w:val="1"/>
-        <w:widowControl w:val="1"/>
-        <w:ind w:left="360" w:hanging="240"/>
-        <w:spacing w:before="0" w:after="40"/>
-      </w:pPr>
-      <w:r>
-        <w:rPr>
-          <w:sz w:val="19"/>
-          <w:color w:val="1E40AF"/>
-        </w:rPr>
-        <w:t xml:space="preserve">▪  </w:t>
-      </w:r>
-      <w:r>
-        <w:rPr>
-          <w:b/>
-          <w:sz w:val="19"/>
-          <w:color w:val="0F294A"/>
-        </w:rPr>
-        <w:t xml:space="preserve">Mission-Critical Cloud Migration: </w:t>
-      </w:r>
-      <w:r>
-        <w:rPr>
-          <w:sz w:val="19"/>
-          <w:color w:val="334155"/>
-        </w:rPr>
-        <w:t>Delivered a cloud migration against a tight 3-month deadline from on-premises Docker Swarm to AWS, migrating approximately 50 Java microservices (Java 11/17 LTS, Spring Boot 2.7/3.x, Payara 5/6) to Amazon EKS (Kubernetes 1.25–1.28) and approximately 15 distributed stateful platforms (Kafka, ZooKeeper, RabbitMQ, MongoDB, MSSQL) to EC2 and RDS.</w:t>
-      </w:r>
-    </w:p>
-    <w:p>
-      <w:pPr>
-        <w:keepNext w:val="1"/>
-        <w:keepLines w:val="1"/>
-        <w:widowControl w:val="1"/>
-        <w:ind w:left="360" w:hanging="240"/>
-        <w:spacing w:before="0" w:after="40"/>
-      </w:pPr>
-      <w:r>
-        <w:rPr>
-          <w:sz w:val="19"/>
-          <w:color w:val="1E40AF"/>
-        </w:rPr>
-        <w:t xml:space="preserve">▪  </w:t>
-      </w:r>
-      <w:r>
-        <w:rPr>
-          <w:b/>
-          <w:sz w:val="19"/>
-          <w:color w:val="0F294A"/>
-        </w:rPr>
-        <w:t xml:space="preserve">GitOps &amp; Release Automation: </w:t>
-      </w:r>
-      <w:r>
-        <w:rPr>
-          <w:sz w:val="19"/>
-          <w:color w:val="334155"/>
-        </w:rPr>
-        <w:t>Implemented Helmfile and ArgoCD for version-controlled Kubernetes release management; engineered enterprise CI/CD workflows in GitHub Actions for Spring Boot and Payara microservices.</w:t>
-      </w:r>
-    </w:p>
-    <w:p>
-      <w:pPr>
-        <w:keepNext w:val="1"/>
-        <w:keepLines w:val="1"/>
-        <w:widowControl w:val="1"/>
-        <w:ind w:left="360" w:hanging="240"/>
-        <w:spacing w:before="0" w:after="40"/>
-      </w:pPr>
-      <w:r>
-        <w:rPr>
-          <w:sz w:val="19"/>
-          <w:color w:val="1E40AF"/>
-        </w:rPr>
-        <w:t xml:space="preserve">▪  </w:t>
-      </w:r>
-      <w:r>
-        <w:rPr>
-          <w:b/>
-          <w:sz w:val="19"/>
-          <w:color w:val="0F294A"/>
-        </w:rPr>
-        <w:t xml:space="preserve">Perimeter DevSecOps: </w:t>
-      </w:r>
-      <w:r>
-        <w:rPr>
-          <w:sz w:val="19"/>
-          <w:color w:val="334155"/>
-        </w:rPr>
-        <w:t>Strengthened infrastructure perimeter defenses in collaboration with Cybersecurity, establishing AWS WAF rules, Shield DDoS protection, Service Control Policies (SCPs), and IDS/IPS inspection.</w:t>
-      </w:r>
-    </w:p>
-    <w:p>
-      <w:pPr>
-        <w:keepLines w:val="1"/>
-        <w:widowControl w:val="1"/>
-        <w:ind w:left="360" w:hanging="240"/>
-        <w:spacing w:before="0" w:after="40"/>
-      </w:pPr>
-      <w:r>
-        <w:rPr>
-          <w:sz w:val="19"/>
-          <w:color w:val="1E40AF"/>
-        </w:rPr>
-        <w:t xml:space="preserve">▪  </w:t>
-      </w:r>
-      <w:r>
-        <w:rPr>
-          <w:b/>
-          <w:sz w:val="19"/>
-          <w:color w:val="0F294A"/>
-        </w:rPr>
-        <w:t xml:space="preserve">IaC, Observability &amp; Database Modernization: </w:t>
-      </w:r>
-      <w:r>
-        <w:rPr>
-          <w:sz w:val="19"/>
-          <w:color w:val="334155"/>
-        </w:rPr>
-        <w:t>Automated infrastructure provisioning using Terraform 1.x and AWS CDK v2 with Go; integrated Datadog and ELK Stack monitoring across migrated workloads, and orchestrated MongoDB and MSSQL cutovers to AWS RDS.</w:t>
+          <w:color w:val="475569"/>
+        </w:rPr>
+        <w:t>05/2024 – 12/2024</w:t>
+      </w:r>
+    </w:p>
+    <w:p>
+      <w:pPr>
+        <w:keepNext w:val="1"/>
+        <w:keepLines w:val="1"/>
+        <w:widowControl w:val="1"/>
+        <w:ind w:left="360" w:hanging="240"/>
+        <w:spacing w:before="0" w:after="40"/>
+      </w:pPr>
+      <w:r>
+        <w:rPr>
+          <w:sz w:val="19"/>
+          <w:color w:val="1E40AF"/>
+        </w:rPr>
+        <w:t xml:space="preserve">▪  </w:t>
+      </w:r>
+      <w:r>
+        <w:rPr>
+          <w:b/>
+          <w:sz w:val="19"/>
+          <w:color w:val="0F294A"/>
+        </w:rPr>
+        <w:t xml:space="preserve">Aggressive Cloud Cost Optimization: </w:t>
+      </w:r>
+      <w:r>
+        <w:rPr>
+          <w:sz w:val="19"/>
+          <w:color w:val="334155"/>
+        </w:rPr>
+        <w:t>Spearheaded multi-tier AWS cost reduction strategies; implemented Compute Savings Plans and RDS Reserved Instances, replaced AWS Transfer Family with self-managed SFTP on EC2, and transitioned from ElastiCache Redis 7 to Valkey 7.2, generating substantial recurring cloud savings.</w:t>
+      </w:r>
+    </w:p>
+    <w:p>
+      <w:pPr>
+        <w:keepNext w:val="1"/>
+        <w:keepLines w:val="1"/>
+        <w:widowControl w:val="1"/>
+        <w:ind w:left="360" w:hanging="240"/>
+        <w:spacing w:before="0" w:after="40"/>
+      </w:pPr>
+      <w:r>
+        <w:rPr>
+          <w:sz w:val="19"/>
+          <w:color w:val="1E40AF"/>
+        </w:rPr>
+        <w:t xml:space="preserve">▪  </w:t>
+      </w:r>
+      <w:r>
+        <w:rPr>
+          <w:b/>
+          <w:sz w:val="19"/>
+          <w:color w:val="0F294A"/>
+        </w:rPr>
+        <w:t xml:space="preserve">Logging Architecture Revamp: </w:t>
+      </w:r>
+      <w:r>
+        <w:rPr>
+          <w:sz w:val="19"/>
+          <w:color w:val="334155"/>
+        </w:rPr>
+        <w:t>Eliminated redundant CloudWatch log ingestion expenses by redesigning log pipelines to route exclusively via Promtail and Loki 3.0 into centralized Grafana dashboards.</w:t>
+      </w:r>
+    </w:p>
+    <w:p>
+      <w:pPr>
+        <w:keepNext w:val="1"/>
+        <w:keepLines w:val="1"/>
+        <w:widowControl w:val="1"/>
+        <w:ind w:left="360" w:hanging="240"/>
+        <w:spacing w:before="0" w:after="40"/>
+      </w:pPr>
+      <w:r>
+        <w:rPr>
+          <w:sz w:val="19"/>
+          <w:color w:val="1E40AF"/>
+        </w:rPr>
+        <w:t xml:space="preserve">▪  </w:t>
+      </w:r>
+      <w:r>
+        <w:rPr>
+          <w:b/>
+          <w:sz w:val="19"/>
+          <w:color w:val="0F294A"/>
+        </w:rPr>
+        <w:t xml:space="preserve">Unified Observability &amp; FinOps Alerts: </w:t>
+      </w:r>
+      <w:r>
+        <w:rPr>
+          <w:sz w:val="19"/>
+          <w:color w:val="334155"/>
+        </w:rPr>
+        <w:t>Built comprehensive Grafana, Loki, Prometheus, and OpenTelemetry observability stacks with custom FinOps cost-allocation dashboards and real-time AWS Billing anomaly alerts.</w:t>
+      </w:r>
+    </w:p>
+    <w:p>
+      <w:pPr>
+        <w:keepNext w:val="1"/>
+        <w:keepLines w:val="1"/>
+        <w:widowControl w:val="1"/>
+        <w:ind w:left="360" w:hanging="240"/>
+        <w:spacing w:before="0" w:after="40"/>
+      </w:pPr>
+      <w:r>
+        <w:rPr>
+          <w:sz w:val="19"/>
+          <w:color w:val="1E40AF"/>
+        </w:rPr>
+        <w:t xml:space="preserve">▪  </w:t>
+      </w:r>
+      <w:r>
+        <w:rPr>
+          <w:b/>
+          <w:sz w:val="19"/>
+          <w:color w:val="0F294A"/>
+        </w:rPr>
+        <w:t xml:space="preserve">Infrastructure Automation: </w:t>
+      </w:r>
+      <w:r>
+        <w:rPr>
+          <w:sz w:val="19"/>
+          <w:color w:val="334155"/>
+        </w:rPr>
+        <w:t>Managed and provisioned Amazon ECS clusters and cloud networking resources with Pulumi and TypeScript.</w:t>
       </w:r>
     </w:p>
     <w:p>
@@ -961,30 +824,22 @@
         <w:tabs>
           <w:tab w:val="right" w:pos="10106"/>
         </w:tabs>
-        <w:spacing w:before="120" w:after="20"/>
-      </w:pPr>
-      <w:r>
-        <w:rPr>
-          <w:b/>
-          <w:sz w:val="21"/>
-          <w:color w:val="0F294A"/>
-        </w:rPr>
-        <w:t>Senior DevOps &amp; Software Engineer</w:t>
-      </w:r>
-      <w:r>
-        <w:rPr>
+        <w:spacing w:before="90" w:after="20"/>
+      </w:pPr>
+      <w:r>
+        <w:rPr>
+          <w:b/>
           <w:sz w:val="20"/>
-          <w:color w:val="64748B"/>
-        </w:rPr>
-        <w:t xml:space="preserve"> | </w:t>
-      </w:r>
-      <w:r>
-        <w:rPr>
-          <w:b/>
-          <w:sz w:val="20"/>
-          <w:color w:val="1E40AF"/>
-        </w:rPr>
-        <w:t>H&amp;M Group</w:t>
+          <w:color w:val="1E40AF"/>
+        </w:rPr>
+        <w:t>Assignment: Arelion (via Expertake)</w:t>
+      </w:r>
+      <w:r>
+        <w:rPr>
+          <w:sz w:val="19"/>
+          <w:color w:val="64748B"/>
+        </w:rPr>
+        <w:t xml:space="preserve"> — Senior SRE &amp; DevOps Consultant</w:t>
       </w:r>
       <w:r>
         <w:tab/>
@@ -992,140 +847,134 @@
       <w:r>
         <w:rPr>
           <w:b/>
-          <w:sz w:val="19"/>
-          <w:color w:val="334155"/>
-        </w:rPr>
-        <w:t>03/2021 – 09/2022</w:t>
-      </w:r>
-      <w:r>
-        <w:rPr>
           <w:sz w:val="18"/>
-          <w:color w:val="64748B"/>
-        </w:rPr>
-        <w:t xml:space="preserve"> (Stockholm, Sweden)</w:t>
-      </w:r>
-    </w:p>
-    <w:p>
-      <w:pPr>
-        <w:keepNext w:val="1"/>
-        <w:keepLines w:val="1"/>
-        <w:widowControl w:val="1"/>
-        <w:ind w:left="360" w:hanging="240"/>
-        <w:spacing w:before="0" w:after="40"/>
-      </w:pPr>
-      <w:r>
-        <w:rPr>
-          <w:sz w:val="19"/>
-          <w:color w:val="1E40AF"/>
-        </w:rPr>
-        <w:t xml:space="preserve">▪  </w:t>
-      </w:r>
-      <w:r>
-        <w:rPr>
-          <w:b/>
-          <w:sz w:val="19"/>
-          <w:color w:val="0F294A"/>
-        </w:rPr>
-        <w:t xml:space="preserve">Data Mesh Proof of Concept: </w:t>
-      </w:r>
-      <w:r>
-        <w:rPr>
-          <w:sz w:val="19"/>
-          <w:color w:val="334155"/>
-        </w:rPr>
-        <w:t>Worked on a Google Cloud Data Mesh proof of concept and served as a technical reference for the planned migration of data assets from Azure Storage to Google BigQuery.</w:t>
-      </w:r>
-    </w:p>
-    <w:p>
-      <w:pPr>
-        <w:keepNext w:val="1"/>
-        <w:keepLines w:val="1"/>
-        <w:widowControl w:val="1"/>
-        <w:ind w:left="360" w:hanging="240"/>
-        <w:spacing w:before="0" w:after="40"/>
-      </w:pPr>
-      <w:r>
-        <w:rPr>
-          <w:sz w:val="19"/>
-          <w:color w:val="1E40AF"/>
-        </w:rPr>
-        <w:t xml:space="preserve">▪  </w:t>
-      </w:r>
-      <w:r>
-        <w:rPr>
-          <w:b/>
-          <w:sz w:val="19"/>
-          <w:color w:val="0F294A"/>
-        </w:rPr>
-        <w:t xml:space="preserve">Real-Time Streaming Pipelines: </w:t>
-      </w:r>
-      <w:r>
-        <w:rPr>
-          <w:sz w:val="19"/>
-          <w:color w:val="334155"/>
-        </w:rPr>
-        <w:t>Implemented Apache Kafka (v2.8/3.x) streaming pipelines utilizing custom Google Cloud Dataflow Flex Templates to stream real-time events into BigQuery and Pub/Sub.</w:t>
-      </w:r>
-    </w:p>
-    <w:p>
-      <w:pPr>
-        <w:keepNext w:val="1"/>
-        <w:keepLines w:val="1"/>
-        <w:widowControl w:val="1"/>
-        <w:ind w:left="360" w:hanging="240"/>
-        <w:spacing w:before="0" w:after="40"/>
-      </w:pPr>
-      <w:r>
-        <w:rPr>
-          <w:sz w:val="19"/>
-          <w:color w:val="1E40AF"/>
-        </w:rPr>
-        <w:t xml:space="preserve">▪  </w:t>
-      </w:r>
-      <w:r>
-        <w:rPr>
-          <w:b/>
-          <w:sz w:val="19"/>
-          <w:color w:val="0F294A"/>
-        </w:rPr>
-        <w:t xml:space="preserve">Multi-Cloud Secrets Management PoC: </w:t>
-      </w:r>
-      <w:r>
-        <w:rPr>
-          <w:sz w:val="19"/>
-          <w:color w:val="334155"/>
-        </w:rPr>
-        <w:t>Developed two proofs of concept, one on Google Cloud Platform (GCP) and another on Azure Kubernetes Service (AKS), to test HashiCorp Vault (v1.8+) secrets management across multi-cloud environments.</w:t>
-      </w:r>
-    </w:p>
-    <w:p>
-      <w:pPr>
-        <w:keepLines w:val="1"/>
-        <w:widowControl w:val="1"/>
-        <w:ind w:left="360" w:hanging="240"/>
-        <w:spacing w:before="0" w:after="40"/>
-      </w:pPr>
-      <w:r>
-        <w:rPr>
-          <w:sz w:val="19"/>
-          <w:color w:val="1E40AF"/>
-        </w:rPr>
-        <w:t xml:space="preserve">▪  </w:t>
-      </w:r>
-      <w:r>
-        <w:rPr>
-          <w:b/>
-          <w:sz w:val="19"/>
-          <w:color w:val="0F294A"/>
-        </w:rPr>
-        <w:t xml:space="preserve">Multi-Cloud CI/CD &amp; Telemetry: </w:t>
-      </w:r>
-      <w:r>
-        <w:rPr>
-          <w:sz w:val="19"/>
-          <w:color w:val="334155"/>
-        </w:rPr>
-        <w:t>Built reusable GitHub Actions workflows across GCP, Azure, and AWS; added Grafana dashboards and operational KPIs, and used Azure Monitor to improve application visibility.</w:t>
+          <w:color w:val="475569"/>
+        </w:rPr>
+        <w:t>09/2022 – 05/2024</w:t>
+      </w:r>
+    </w:p>
+    <w:p>
+      <w:pPr>
+        <w:keepNext w:val="1"/>
+        <w:keepLines w:val="1"/>
+        <w:widowControl w:val="1"/>
+        <w:ind w:left="360" w:hanging="240"/>
+        <w:spacing w:before="0" w:after="40"/>
+      </w:pPr>
+      <w:r>
+        <w:rPr>
+          <w:sz w:val="19"/>
+          <w:color w:val="1E40AF"/>
+        </w:rPr>
+        <w:t xml:space="preserve">▪  </w:t>
+      </w:r>
+      <w:r>
+        <w:rPr>
+          <w:b/>
+          <w:sz w:val="19"/>
+          <w:color w:val="0F294A"/>
+        </w:rPr>
+        <w:t xml:space="preserve">Mission-Critical Cloud Migration: </w:t>
+      </w:r>
+      <w:r>
+        <w:rPr>
+          <w:sz w:val="19"/>
+          <w:color w:val="334155"/>
+        </w:rPr>
+        <w:t>Delivered a cloud migration against a tight 3-month deadline from on-premises Docker Swarm to AWS, migrating approximately 50 Java microservices (Java 11/17 LTS, Spring Boot 2.7/3.x, Payara 5/6) to Amazon EKS (Kubernetes 1.25–1.28) and approximately 15 distributed stateful platforms (Kafka, ZooKeeper, RabbitMQ, MongoDB, MSSQL) to EC2 and RDS.</w:t>
+      </w:r>
+    </w:p>
+    <w:p>
+      <w:pPr>
+        <w:keepNext w:val="1"/>
+        <w:keepLines w:val="1"/>
+        <w:widowControl w:val="1"/>
+        <w:ind w:left="360" w:hanging="240"/>
+        <w:spacing w:before="0" w:after="40"/>
+      </w:pPr>
+      <w:r>
+        <w:rPr>
+          <w:sz w:val="19"/>
+          <w:color w:val="1E40AF"/>
+        </w:rPr>
+        <w:t xml:space="preserve">▪  </w:t>
+      </w:r>
+      <w:r>
+        <w:rPr>
+          <w:b/>
+          <w:sz w:val="19"/>
+          <w:color w:val="0F294A"/>
+        </w:rPr>
+        <w:t xml:space="preserve">GitOps &amp; Release Automation: </w:t>
+      </w:r>
+      <w:r>
+        <w:rPr>
+          <w:sz w:val="19"/>
+          <w:color w:val="334155"/>
+        </w:rPr>
+        <w:t>Implemented Helmfile and ArgoCD for version-controlled Kubernetes release management; engineered enterprise CI/CD workflows in GitHub Actions for Spring Boot and Payara microservices.</w:t>
+      </w:r>
+    </w:p>
+    <w:p>
+      <w:pPr>
+        <w:keepNext w:val="1"/>
+        <w:keepLines w:val="1"/>
+        <w:widowControl w:val="1"/>
+        <w:ind w:left="360" w:hanging="240"/>
+        <w:spacing w:before="0" w:after="40"/>
+      </w:pPr>
+      <w:r>
+        <w:rPr>
+          <w:sz w:val="19"/>
+          <w:color w:val="1E40AF"/>
+        </w:rPr>
+        <w:t xml:space="preserve">▪  </w:t>
+      </w:r>
+      <w:r>
+        <w:rPr>
+          <w:b/>
+          <w:sz w:val="19"/>
+          <w:color w:val="0F294A"/>
+        </w:rPr>
+        <w:t xml:space="preserve">Perimeter DevSecOps: </w:t>
+      </w:r>
+      <w:r>
+        <w:rPr>
+          <w:sz w:val="19"/>
+          <w:color w:val="334155"/>
+        </w:rPr>
+        <w:t>Strengthened infrastructure perimeter defenses in collaboration with Cybersecurity, establishing AWS WAF rules, Shield DDoS protection, Service Control Policies (SCPs), and IDS/IPS inspection.</w:t>
+      </w:r>
+    </w:p>
+    <w:p>
+      <w:pPr>
+        <w:keepNext w:val="1"/>
+        <w:keepLines w:val="1"/>
+        <w:widowControl w:val="1"/>
+        <w:ind w:left="360" w:hanging="240"/>
+        <w:spacing w:before="0" w:after="40"/>
+      </w:pPr>
+      <w:r>
+        <w:rPr>
+          <w:sz w:val="19"/>
+          <w:color w:val="1E40AF"/>
+        </w:rPr>
+        <w:t xml:space="preserve">▪  </w:t>
+      </w:r>
+      <w:r>
+        <w:rPr>
+          <w:b/>
+          <w:sz w:val="19"/>
+          <w:color w:val="0F294A"/>
+        </w:rPr>
+        <w:t xml:space="preserve">IaC, Observability &amp; Database Modernization: </w:t>
+      </w:r>
+      <w:r>
+        <w:rPr>
+          <w:sz w:val="19"/>
+          <w:color w:val="334155"/>
+        </w:rPr>
+        <w:t>Automated infrastructure provisioning using Terraform 1.x and AWS CDK v2 with Go; integrated Datadog and ELK Stack monitoring across migrated workloads, and orchestrated MongoDB and MSSQL cutovers to AWS RDS.</w:t>
       </w:r>
     </w:p>
     <w:p>
@@ -1136,30 +985,183 @@
         <w:tabs>
           <w:tab w:val="right" w:pos="10106"/>
         </w:tabs>
-        <w:spacing w:before="120" w:after="20"/>
-      </w:pPr>
-      <w:r>
-        <w:rPr>
-          <w:b/>
-          <w:sz w:val="21"/>
-          <w:color w:val="0F294A"/>
-        </w:rPr>
-        <w:t>Senior DevOps Chapter Leader</w:t>
-      </w:r>
-      <w:r>
-        <w:rPr>
+        <w:spacing w:before="90" w:after="20"/>
+      </w:pPr>
+      <w:r>
+        <w:rPr>
+          <w:b/>
           <w:sz w:val="20"/>
-          <w:color w:val="64748B"/>
-        </w:rPr>
-        <w:t xml:space="preserve"> | </w:t>
-      </w:r>
+          <w:color w:val="1E40AF"/>
+        </w:rPr>
+        <w:t>Assignment: H&amp;M Group</w:t>
+      </w:r>
+      <w:r>
+        <w:rPr>
+          <w:sz w:val="19"/>
+          <w:color w:val="64748B"/>
+        </w:rPr>
+        <w:t xml:space="preserve"> — Senior DevOps &amp; Software Engineer</w:t>
+      </w:r>
+      <w:r>
+        <w:tab/>
+      </w:r>
+      <w:r>
+        <w:rPr>
+          <w:b/>
+          <w:sz w:val="18"/>
+          <w:color w:val="475569"/>
+        </w:rPr>
+        <w:t>03/2021 – 09/2022</w:t>
+      </w:r>
+    </w:p>
+    <w:p>
+      <w:pPr>
+        <w:keepNext w:val="1"/>
+        <w:keepLines w:val="1"/>
+        <w:widowControl w:val="1"/>
+        <w:ind w:left="360" w:hanging="240"/>
+        <w:spacing w:before="0" w:after="40"/>
+      </w:pPr>
+      <w:r>
+        <w:rPr>
+          <w:sz w:val="19"/>
+          <w:color w:val="1E40AF"/>
+        </w:rPr>
+        <w:t xml:space="preserve">▪  </w:t>
+      </w:r>
+      <w:r>
+        <w:rPr>
+          <w:b/>
+          <w:sz w:val="19"/>
+          <w:color w:val="0F294A"/>
+        </w:rPr>
+        <w:t xml:space="preserve">Data Mesh Proof of Concept: </w:t>
+      </w:r>
+      <w:r>
+        <w:rPr>
+          <w:sz w:val="19"/>
+          <w:color w:val="334155"/>
+        </w:rPr>
+        <w:t>Worked on a Google Cloud Data Mesh proof of concept and served as a technical reference for the planned migration of data assets from Azure Storage to Google BigQuery.</w:t>
+      </w:r>
+    </w:p>
+    <w:p>
+      <w:pPr>
+        <w:keepNext w:val="1"/>
+        <w:keepLines w:val="1"/>
+        <w:widowControl w:val="1"/>
+        <w:ind w:left="360" w:hanging="240"/>
+        <w:spacing w:before="0" w:after="40"/>
+      </w:pPr>
+      <w:r>
+        <w:rPr>
+          <w:sz w:val="19"/>
+          <w:color w:val="1E40AF"/>
+        </w:rPr>
+        <w:t xml:space="preserve">▪  </w:t>
+      </w:r>
+      <w:r>
+        <w:rPr>
+          <w:b/>
+          <w:sz w:val="19"/>
+          <w:color w:val="0F294A"/>
+        </w:rPr>
+        <w:t xml:space="preserve">Real-Time Streaming Pipelines: </w:t>
+      </w:r>
+      <w:r>
+        <w:rPr>
+          <w:sz w:val="19"/>
+          <w:color w:val="334155"/>
+        </w:rPr>
+        <w:t>Implemented Apache Kafka (v2.8/3.x) streaming pipelines utilizing custom Google Cloud Dataflow Flex Templates to stream real-time events into BigQuery and Pub/Sub.</w:t>
+      </w:r>
+    </w:p>
+    <w:p>
+      <w:pPr>
+        <w:keepNext w:val="1"/>
+        <w:keepLines w:val="1"/>
+        <w:widowControl w:val="1"/>
+        <w:ind w:left="360" w:hanging="240"/>
+        <w:spacing w:before="0" w:after="40"/>
+      </w:pPr>
+      <w:r>
+        <w:rPr>
+          <w:sz w:val="19"/>
+          <w:color w:val="1E40AF"/>
+        </w:rPr>
+        <w:t xml:space="preserve">▪  </w:t>
+      </w:r>
+      <w:r>
+        <w:rPr>
+          <w:b/>
+          <w:sz w:val="19"/>
+          <w:color w:val="0F294A"/>
+        </w:rPr>
+        <w:t xml:space="preserve">Multi-Cloud Secrets Management PoC: </w:t>
+      </w:r>
+      <w:r>
+        <w:rPr>
+          <w:sz w:val="19"/>
+          <w:color w:val="334155"/>
+        </w:rPr>
+        <w:t>Developed two proofs of concept, one on Google Cloud Platform (GCP) and another on Azure Kubernetes Service (AKS), to test HashiCorp Vault (v1.8+) secrets management across multi-cloud environments.</w:t>
+      </w:r>
+    </w:p>
+    <w:p>
+      <w:pPr>
+        <w:keepNext w:val="1"/>
+        <w:keepLines w:val="1"/>
+        <w:widowControl w:val="1"/>
+        <w:ind w:left="360" w:hanging="240"/>
+        <w:spacing w:before="0" w:after="40"/>
+      </w:pPr>
+      <w:r>
+        <w:rPr>
+          <w:sz w:val="19"/>
+          <w:color w:val="1E40AF"/>
+        </w:rPr>
+        <w:t xml:space="preserve">▪  </w:t>
+      </w:r>
+      <w:r>
+        <w:rPr>
+          <w:b/>
+          <w:sz w:val="19"/>
+          <w:color w:val="0F294A"/>
+        </w:rPr>
+        <w:t xml:space="preserve">Multi-Cloud CI/CD &amp; Telemetry: </w:t>
+      </w:r>
+      <w:r>
+        <w:rPr>
+          <w:sz w:val="19"/>
+          <w:color w:val="334155"/>
+        </w:rPr>
+        <w:t>Built reusable GitHub Actions workflows across GCP, Azure, and AWS; added Grafana dashboards and operational KPIs, and used Azure Monitor to improve application visibility.</w:t>
+      </w:r>
+    </w:p>
+    <w:p>
+      <w:pPr>
+        <w:keepNext w:val="1"/>
+        <w:keepLines w:val="1"/>
+        <w:widowControl w:val="1"/>
+        <w:tabs>
+          <w:tab w:val="right" w:pos="10106"/>
+        </w:tabs>
+        <w:spacing w:before="90" w:after="20"/>
+      </w:pPr>
       <w:r>
         <w:rPr>
           <w:b/>
           <w:sz w:val="20"/>
           <w:color w:val="1E40AF"/>
         </w:rPr>
-        <w:t>Tele2</w:t>
+        <w:t>Assignment: Tele2</w:t>
+      </w:r>
+      <w:r>
+        <w:rPr>
+          <w:sz w:val="19"/>
+          <w:color w:val="64748B"/>
+        </w:rPr>
+        <w:t xml:space="preserve"> — Senior DevOps Chapter Leader</w:t>
       </w:r>
       <w:r>
         <w:tab/>
@@ -1167,17 +1169,10 @@
       <w:r>
         <w:rPr>
           <w:b/>
-          <w:sz w:val="19"/>
-          <w:color w:val="334155"/>
+          <w:sz w:val="18"/>
+          <w:color w:val="475569"/>
         </w:rPr>
         <w:t>07/2020 – 03/2021</w:t>
-      </w:r>
-      <w:r>
-        <w:rPr>
-          <w:sz w:val="18"/>
-          <w:color w:val="64748B"/>
-        </w:rPr>
-        <w:t xml:space="preserve"> (Stockholm, Sweden)</w:t>
       </w:r>
     </w:p>
     <w:p>

</xml_diff>

<commit_message>
Add Earlier Career (2005-2015) roles: BNP Paribas Cardif, JPMorgan, InterSystems, PowerMedia, OAKS Agency
</commit_message>
<xml_diff>
--- a/MGarcia_CV_Redesigned_2026.docx
+++ b/MGarcia_CV_Redesigned_2026.docx
@@ -1821,6 +1821,652 @@
           <w:color w:val="334155"/>
         </w:rPr>
         <w:t>Planned automated deployment pipelines using Puppet, Docker, and Jenkins; configured ELK Stack monitoring and supported Guidewire production integrations.</w:t>
+      </w:r>
+    </w:p>
+    <w:p>
+      <w:pPr>
+        <w:keepNext w:val="1"/>
+        <w:keepLines w:val="1"/>
+        <w:widowControl w:val="1"/>
+        <w:pBdr>
+          <w:bottom w:val="single" w:sz="6" w:space="4" w:color="CBD5E1"/>
+        </w:pBdr>
+        <w:spacing w:before="180" w:after="80"/>
+      </w:pPr>
+      <w:r>
+        <w:rPr>
+          <w:b/>
+          <w:sz w:val="24"/>
+          <w:color w:val="0F294A"/>
+        </w:rPr>
+        <w:t>EARLIER CAREER &amp; SOFTWARE ENGINEERING (2005 – 2015)</w:t>
+      </w:r>
+    </w:p>
+    <w:p>
+      <w:pPr>
+        <w:keepNext w:val="1"/>
+        <w:keepLines w:val="1"/>
+        <w:widowControl w:val="1"/>
+        <w:tabs>
+          <w:tab w:val="right" w:pos="10106"/>
+        </w:tabs>
+        <w:spacing w:before="120" w:after="20"/>
+      </w:pPr>
+      <w:r>
+        <w:rPr>
+          <w:b/>
+          <w:sz w:val="21"/>
+          <w:color w:val="0F294A"/>
+        </w:rPr>
+        <w:t>Java Developer &amp; DevOps Specialist</w:t>
+      </w:r>
+      <w:r>
+        <w:rPr>
+          <w:sz w:val="20"/>
+          <w:color w:val="64748B"/>
+        </w:rPr>
+        <w:t xml:space="preserve"> | </w:t>
+      </w:r>
+      <w:r>
+        <w:rPr>
+          <w:b/>
+          <w:sz w:val="20"/>
+          <w:color w:val="1E40AF"/>
+        </w:rPr>
+        <w:t>BNP Paribas Cardif</w:t>
+      </w:r>
+      <w:r>
+        <w:tab/>
+      </w:r>
+      <w:r>
+        <w:rPr>
+          <w:b/>
+          <w:sz w:val="19"/>
+          <w:color w:val="334155"/>
+        </w:rPr>
+        <w:t>08/2014 – 02/2015</w:t>
+      </w:r>
+      <w:r>
+        <w:rPr>
+          <w:sz w:val="18"/>
+          <w:color w:val="64748B"/>
+        </w:rPr>
+        <w:t xml:space="preserve"> (Santiago, Chile)</w:t>
+      </w:r>
+    </w:p>
+    <w:p>
+      <w:pPr>
+        <w:keepNext w:val="1"/>
+        <w:keepLines w:val="1"/>
+        <w:widowControl w:val="1"/>
+        <w:ind w:left="360" w:hanging="240"/>
+        <w:spacing w:before="0" w:after="40"/>
+      </w:pPr>
+      <w:r>
+        <w:rPr>
+          <w:sz w:val="19"/>
+          <w:color w:val="1E40AF"/>
+        </w:rPr>
+        <w:t xml:space="preserve">▪  </w:t>
+      </w:r>
+      <w:r>
+        <w:rPr>
+          <w:b/>
+          <w:sz w:val="19"/>
+          <w:color w:val="0F294A"/>
+        </w:rPr>
+        <w:t xml:space="preserve">Application Architecture &amp; Microservices: </w:t>
+      </w:r>
+      <w:r>
+        <w:rPr>
+          <w:sz w:val="19"/>
+          <w:color w:val="334155"/>
+        </w:rPr>
+        <w:t>Engineered backend microservices with Node.js and Java (Spring Boot) integrated with Oracle PL/SQL stored procedures.</w:t>
+      </w:r>
+    </w:p>
+    <w:p>
+      <w:pPr>
+        <w:keepNext w:val="1"/>
+        <w:keepLines w:val="1"/>
+        <w:widowControl w:val="1"/>
+        <w:ind w:left="360" w:hanging="240"/>
+        <w:spacing w:before="0" w:after="40"/>
+      </w:pPr>
+      <w:r>
+        <w:rPr>
+          <w:sz w:val="19"/>
+          <w:color w:val="1E40AF"/>
+        </w:rPr>
+        <w:t xml:space="preserve">▪  </w:t>
+      </w:r>
+      <w:r>
+        <w:rPr>
+          <w:b/>
+          <w:sz w:val="19"/>
+          <w:color w:val="0F294A"/>
+        </w:rPr>
+        <w:t xml:space="preserve">Enterprise JEE Engineering: </w:t>
+      </w:r>
+      <w:r>
+        <w:rPr>
+          <w:sz w:val="19"/>
+          <w:color w:val="334155"/>
+        </w:rPr>
+        <w:t>Designed, developed, and deployed enterprise integration services using J2EE, Spring, Hibernate, Web Services (SOAP/REST), and Maven.</w:t>
+      </w:r>
+    </w:p>
+    <w:p>
+      <w:pPr>
+        <w:keepLines w:val="1"/>
+        <w:widowControl w:val="1"/>
+        <w:ind w:left="360" w:hanging="240"/>
+        <w:spacing w:before="0" w:after="40"/>
+      </w:pPr>
+      <w:r>
+        <w:rPr>
+          <w:sz w:val="19"/>
+          <w:color w:val="1E40AF"/>
+        </w:rPr>
+        <w:t xml:space="preserve">▪  </w:t>
+      </w:r>
+      <w:r>
+        <w:rPr>
+          <w:b/>
+          <w:sz w:val="19"/>
+          <w:color w:val="0F294A"/>
+        </w:rPr>
+        <w:t xml:space="preserve">DevOps POC &amp; Streaming Platform: </w:t>
+      </w:r>
+      <w:r>
+        <w:rPr>
+          <w:sz w:val="19"/>
+          <w:color w:val="334155"/>
+        </w:rPr>
+        <w:t>Spearheaded Cardif's initial DevOps continuous integration POC utilizing Jenkins, Chef, Linux, SonarQube, Git, Artifactory, and Selenium; configured and administered Apache Kafka clusters.</w:t>
+      </w:r>
+    </w:p>
+    <w:p>
+      <w:pPr>
+        <w:keepNext w:val="1"/>
+        <w:keepLines w:val="1"/>
+        <w:widowControl w:val="1"/>
+        <w:tabs>
+          <w:tab w:val="right" w:pos="10106"/>
+        </w:tabs>
+        <w:spacing w:before="120" w:after="20"/>
+      </w:pPr>
+      <w:r>
+        <w:rPr>
+          <w:b/>
+          <w:sz w:val="21"/>
+          <w:color w:val="0F294A"/>
+        </w:rPr>
+        <w:t>Java Consultant &amp; Software Engineer</w:t>
+      </w:r>
+      <w:r>
+        <w:rPr>
+          <w:sz w:val="20"/>
+          <w:color w:val="64748B"/>
+        </w:rPr>
+        <w:t xml:space="preserve"> | </w:t>
+      </w:r>
+      <w:r>
+        <w:rPr>
+          <w:b/>
+          <w:sz w:val="20"/>
+          <w:color w:val="1E40AF"/>
+        </w:rPr>
+        <w:t>JPMorgan</w:t>
+      </w:r>
+      <w:r>
+        <w:tab/>
+      </w:r>
+      <w:r>
+        <w:rPr>
+          <w:b/>
+          <w:sz w:val="19"/>
+          <w:color w:val="334155"/>
+        </w:rPr>
+        <w:t>05/2013 – 05/2014</w:t>
+      </w:r>
+      <w:r>
+        <w:rPr>
+          <w:sz w:val="18"/>
+          <w:color w:val="64748B"/>
+        </w:rPr>
+        <w:t xml:space="preserve"> (Santiago, Chile)</w:t>
+      </w:r>
+    </w:p>
+    <w:p>
+      <w:pPr>
+        <w:keepNext w:val="1"/>
+        <w:keepLines w:val="1"/>
+        <w:widowControl w:val="1"/>
+        <w:ind w:left="360" w:hanging="240"/>
+        <w:spacing w:before="0" w:after="40"/>
+      </w:pPr>
+      <w:r>
+        <w:rPr>
+          <w:sz w:val="19"/>
+          <w:color w:val="1E40AF"/>
+        </w:rPr>
+        <w:t xml:space="preserve">▪  </w:t>
+      </w:r>
+      <w:r>
+        <w:rPr>
+          <w:b/>
+          <w:sz w:val="19"/>
+          <w:color w:val="0F294A"/>
+        </w:rPr>
+        <w:t xml:space="preserve">Core Banking JEE Development: </w:t>
+      </w:r>
+      <w:r>
+        <w:rPr>
+          <w:sz w:val="19"/>
+          <w:color w:val="334155"/>
+        </w:rPr>
+        <w:t>Developed and supported mission-critical JEE applications using Spring, Hibernate, JMS messaging queues, Hermes, Pentaho, and Oracle 11g.</w:t>
+      </w:r>
+    </w:p>
+    <w:p>
+      <w:pPr>
+        <w:keepLines w:val="1"/>
+        <w:widowControl w:val="1"/>
+        <w:ind w:left="360" w:hanging="240"/>
+        <w:spacing w:before="0" w:after="40"/>
+      </w:pPr>
+      <w:r>
+        <w:rPr>
+          <w:sz w:val="19"/>
+          <w:color w:val="1E40AF"/>
+        </w:rPr>
+        <w:t xml:space="preserve">▪  </w:t>
+      </w:r>
+      <w:r>
+        <w:rPr>
+          <w:b/>
+          <w:sz w:val="19"/>
+          <w:color w:val="0F294A"/>
+        </w:rPr>
+        <w:t xml:space="preserve">Production Reliability &amp; Release Engineering: </w:t>
+      </w:r>
+      <w:r>
+        <w:rPr>
+          <w:sz w:val="19"/>
+          <w:color w:val="334155"/>
+        </w:rPr>
+        <w:t>Provided 24/7 production environment support, executing scheduled releases, hotfixes, patches, and Oracle PL/SQL stored procedures.</w:t>
+      </w:r>
+    </w:p>
+    <w:p>
+      <w:pPr>
+        <w:keepNext w:val="1"/>
+        <w:keepLines w:val="1"/>
+        <w:widowControl w:val="1"/>
+        <w:tabs>
+          <w:tab w:val="right" w:pos="10106"/>
+        </w:tabs>
+        <w:spacing w:before="120" w:after="20"/>
+      </w:pPr>
+      <w:r>
+        <w:rPr>
+          <w:b/>
+          <w:sz w:val="21"/>
+          <w:color w:val="0F294A"/>
+        </w:rPr>
+        <w:t>Technical Specialist &amp; Integration Lead</w:t>
+      </w:r>
+      <w:r>
+        <w:rPr>
+          <w:sz w:val="20"/>
+          <w:color w:val="64748B"/>
+        </w:rPr>
+        <w:t xml:space="preserve"> | </w:t>
+      </w:r>
+      <w:r>
+        <w:rPr>
+          <w:b/>
+          <w:sz w:val="20"/>
+          <w:color w:val="1E40AF"/>
+        </w:rPr>
+        <w:t>InterSystems</w:t>
+      </w:r>
+      <w:r>
+        <w:tab/>
+      </w:r>
+      <w:r>
+        <w:rPr>
+          <w:b/>
+          <w:sz w:val="19"/>
+          <w:color w:val="334155"/>
+        </w:rPr>
+        <w:t>02/2009 – 04/2013</w:t>
+      </w:r>
+      <w:r>
+        <w:rPr>
+          <w:sz w:val="18"/>
+          <w:color w:val="64748B"/>
+        </w:rPr>
+        <w:t xml:space="preserve"> (Boston, USA • Sydney, AU • Chile)</w:t>
+      </w:r>
+    </w:p>
+    <w:p>
+      <w:pPr>
+        <w:keepNext w:val="1"/>
+        <w:keepLines w:val="1"/>
+        <w:widowControl w:val="1"/>
+        <w:ind w:left="360" w:hanging="240"/>
+        <w:spacing w:before="0" w:after="40"/>
+      </w:pPr>
+      <w:r>
+        <w:rPr>
+          <w:sz w:val="19"/>
+          <w:color w:val="1E40AF"/>
+        </w:rPr>
+        <w:t xml:space="preserve">▪  </w:t>
+      </w:r>
+      <w:r>
+        <w:rPr>
+          <w:b/>
+          <w:sz w:val="19"/>
+          <w:color w:val="0F294A"/>
+        </w:rPr>
+        <w:t xml:space="preserve">Nationwide SIDRA Healthcare Platform: </w:t>
+      </w:r>
+      <w:r>
+        <w:rPr>
+          <w:sz w:val="19"/>
+          <w:color w:val="334155"/>
+        </w:rPr>
+        <w:t>Served as core technical reference for the Chilean Ministry of Health SIDRA platform deployed across 27 Health Services nationwide, developing in Caché ObjectScript.</w:t>
+      </w:r>
+    </w:p>
+    <w:p>
+      <w:pPr>
+        <w:keepNext w:val="1"/>
+        <w:keepLines w:val="1"/>
+        <w:widowControl w:val="1"/>
+        <w:ind w:left="360" w:hanging="240"/>
+        <w:spacing w:before="0" w:after="40"/>
+      </w:pPr>
+      <w:r>
+        <w:rPr>
+          <w:sz w:val="19"/>
+          <w:color w:val="1E40AF"/>
+        </w:rPr>
+        <w:t xml:space="preserve">▪  </w:t>
+      </w:r>
+      <w:r>
+        <w:rPr>
+          <w:b/>
+          <w:sz w:val="19"/>
+          <w:color w:val="0F294A"/>
+        </w:rPr>
+        <w:t xml:space="preserve">Healthcare Interoperability &amp; Standards: </w:t>
+      </w:r>
+      <w:r>
+        <w:rPr>
+          <w:sz w:val="19"/>
+          <w:color w:val="334155"/>
+        </w:rPr>
+        <w:t>Led technical standards and integration architecture for external clinical systems (RIS-PACS, FONASA) utilizing HL7 and DICOM communication protocols.</w:t>
+      </w:r>
+    </w:p>
+    <w:p>
+      <w:pPr>
+        <w:keepLines w:val="1"/>
+        <w:widowControl w:val="1"/>
+        <w:ind w:left="360" w:hanging="240"/>
+        <w:spacing w:before="0" w:after="40"/>
+      </w:pPr>
+      <w:r>
+        <w:rPr>
+          <w:sz w:val="19"/>
+          <w:color w:val="1E40AF"/>
+        </w:rPr>
+        <w:t xml:space="preserve">▪  </w:t>
+      </w:r>
+      <w:r>
+        <w:rPr>
+          <w:b/>
+          <w:sz w:val="19"/>
+          <w:color w:val="0F294A"/>
+        </w:rPr>
+        <w:t xml:space="preserve">Hospital Information Systems (HIS): </w:t>
+      </w:r>
+      <w:r>
+        <w:rPr>
+          <w:sz w:val="19"/>
+          <w:color w:val="334155"/>
+        </w:rPr>
+        <w:t>Supervised and coordinated system integrations for the Military Hospital of Santiago HIS deployment.</w:t>
+      </w:r>
+    </w:p>
+    <w:p>
+      <w:pPr>
+        <w:keepNext w:val="1"/>
+        <w:keepLines w:val="1"/>
+        <w:widowControl w:val="1"/>
+        <w:tabs>
+          <w:tab w:val="right" w:pos="10106"/>
+        </w:tabs>
+        <w:spacing w:before="120" w:after="20"/>
+      </w:pPr>
+      <w:r>
+        <w:rPr>
+          <w:b/>
+          <w:sz w:val="21"/>
+          <w:color w:val="0F294A"/>
+        </w:rPr>
+        <w:t>Head Developer</w:t>
+      </w:r>
+      <w:r>
+        <w:rPr>
+          <w:sz w:val="20"/>
+          <w:color w:val="64748B"/>
+        </w:rPr>
+        <w:t xml:space="preserve"> | </w:t>
+      </w:r>
+      <w:r>
+        <w:rPr>
+          <w:b/>
+          <w:sz w:val="20"/>
+          <w:color w:val="1E40AF"/>
+        </w:rPr>
+        <w:t>PowerMedia</w:t>
+      </w:r>
+      <w:r>
+        <w:tab/>
+      </w:r>
+      <w:r>
+        <w:rPr>
+          <w:b/>
+          <w:sz w:val="19"/>
+          <w:color w:val="334155"/>
+        </w:rPr>
+        <w:t>01/2008 – 01/2009</w:t>
+      </w:r>
+      <w:r>
+        <w:rPr>
+          <w:sz w:val="18"/>
+          <w:color w:val="64748B"/>
+        </w:rPr>
+        <w:t xml:space="preserve"> (Santiago, Chile)</w:t>
+      </w:r>
+    </w:p>
+    <w:p>
+      <w:pPr>
+        <w:keepNext w:val="1"/>
+        <w:keepLines w:val="1"/>
+        <w:widowControl w:val="1"/>
+        <w:ind w:left="360" w:hanging="240"/>
+        <w:spacing w:before="0" w:after="40"/>
+      </w:pPr>
+      <w:r>
+        <w:rPr>
+          <w:sz w:val="19"/>
+          <w:color w:val="1E40AF"/>
+        </w:rPr>
+        <w:t xml:space="preserve">▪  </w:t>
+      </w:r>
+      <w:r>
+        <w:rPr>
+          <w:b/>
+          <w:sz w:val="19"/>
+          <w:color w:val="0F294A"/>
+        </w:rPr>
+        <w:t xml:space="preserve">Enterprise System Architecture: </w:t>
+      </w:r>
+      <w:r>
+        <w:rPr>
+          <w:sz w:val="19"/>
+          <w:color w:val="334155"/>
+        </w:rPr>
+        <w:t>Architected and delivered web systems using Python, Java, Flex, PHP, MySQL, PostgreSQL, and Oracle for enterprise clients including Mattel, Michelin, and Coca-Cola.</w:t>
+      </w:r>
+    </w:p>
+    <w:p>
+      <w:pPr>
+        <w:keepLines w:val="1"/>
+        <w:widowControl w:val="1"/>
+        <w:ind w:left="360" w:hanging="240"/>
+        <w:spacing w:before="0" w:after="40"/>
+      </w:pPr>
+      <w:r>
+        <w:rPr>
+          <w:sz w:val="19"/>
+          <w:color w:val="1E40AF"/>
+        </w:rPr>
+        <w:t xml:space="preserve">▪  </w:t>
+      </w:r>
+      <w:r>
+        <w:rPr>
+          <w:b/>
+          <w:sz w:val="19"/>
+          <w:color w:val="0F294A"/>
+        </w:rPr>
+        <w:t xml:space="preserve">Infrastructure &amp; Public Sector Consulting: </w:t>
+      </w:r>
+      <w:r>
+        <w:rPr>
+          <w:sz w:val="19"/>
+          <w:color w:val="334155"/>
+        </w:rPr>
+        <w:t>Administered Linux servers and development networking; delivered a web application for the Ministry of Work (04/2008 – 07/2008) for social reform benefits administration using PHP and PostgreSQL.</w:t>
+      </w:r>
+    </w:p>
+    <w:p>
+      <w:pPr>
+        <w:keepNext w:val="1"/>
+        <w:keepLines w:val="1"/>
+        <w:widowControl w:val="1"/>
+        <w:tabs>
+          <w:tab w:val="right" w:pos="10106"/>
+        </w:tabs>
+        <w:spacing w:before="120" w:after="20"/>
+      </w:pPr>
+      <w:r>
+        <w:rPr>
+          <w:b/>
+          <w:sz w:val="21"/>
+          <w:color w:val="0F294A"/>
+        </w:rPr>
+        <w:t>SysAdmin &amp; Lead Java Developer</w:t>
+      </w:r>
+      <w:r>
+        <w:rPr>
+          <w:sz w:val="20"/>
+          <w:color w:val="64748B"/>
+        </w:rPr>
+        <w:t xml:space="preserve"> | </w:t>
+      </w:r>
+      <w:r>
+        <w:rPr>
+          <w:b/>
+          <w:sz w:val="20"/>
+          <w:color w:val="1E40AF"/>
+        </w:rPr>
+        <w:t>OAKS Agency</w:t>
+      </w:r>
+      <w:r>
+        <w:tab/>
+      </w:r>
+      <w:r>
+        <w:rPr>
+          <w:b/>
+          <w:sz w:val="19"/>
+          <w:color w:val="334155"/>
+        </w:rPr>
+        <w:t>01/2005 – 12/2007</w:t>
+      </w:r>
+      <w:r>
+        <w:rPr>
+          <w:sz w:val="18"/>
+          <w:color w:val="64748B"/>
+        </w:rPr>
+        <w:t xml:space="preserve"> (Santiago, Chile)</w:t>
+      </w:r>
+    </w:p>
+    <w:p>
+      <w:pPr>
+        <w:keepNext w:val="1"/>
+        <w:keepLines w:val="1"/>
+        <w:widowControl w:val="1"/>
+        <w:ind w:left="360" w:hanging="240"/>
+        <w:spacing w:before="0" w:after="40"/>
+      </w:pPr>
+      <w:r>
+        <w:rPr>
+          <w:sz w:val="19"/>
+          <w:color w:val="1E40AF"/>
+        </w:rPr>
+        <w:t xml:space="preserve">▪  </w:t>
+      </w:r>
+      <w:r>
+        <w:rPr>
+          <w:b/>
+          <w:sz w:val="19"/>
+          <w:color w:val="0F294A"/>
+        </w:rPr>
+        <w:t xml:space="preserve">Infrastructure &amp; Storage Administration: </w:t>
+      </w:r>
+      <w:r>
+        <w:rPr>
+          <w:sz w:val="19"/>
+          <w:color w:val="334155"/>
+        </w:rPr>
+        <w:t>Administered corporate Linux servers, network switches, routers, security perimeters, and hardware RAID (Type 3 &amp; 5) disk arrays.</w:t>
+      </w:r>
+    </w:p>
+    <w:p>
+      <w:pPr>
+        <w:keepLines w:val="1"/>
+        <w:widowControl w:val="1"/>
+        <w:ind w:left="360" w:hanging="240"/>
+        <w:spacing w:before="0" w:after="40"/>
+      </w:pPr>
+      <w:r>
+        <w:rPr>
+          <w:sz w:val="19"/>
+          <w:color w:val="1E40AF"/>
+        </w:rPr>
+        <w:t xml:space="preserve">▪  </w:t>
+      </w:r>
+      <w:r>
+        <w:rPr>
+          <w:b/>
+          <w:sz w:val="19"/>
+          <w:color w:val="0F294A"/>
+        </w:rPr>
+        <w:t xml:space="preserve">Banking &amp; Retail Web Engineering: </w:t>
+      </w:r>
+      <w:r>
+        <w:rPr>
+          <w:sz w:val="19"/>
+          <w:color w:val="334155"/>
+        </w:rPr>
+        <w:t>Promoted to Lead Developer, architecting web applications and portals in Java (Servlets, Applets, JSP), PHP, Python, and Perl with MySQL and PostgreSQL for banking and retail clients.</w:t>
       </w:r>
     </w:p>
     <w:p>
@@ -2356,6 +3002,92 @@
           <w:color w:val="475569"/>
         </w:rPr>
         <w:t>2007</w:t>
+      </w:r>
+    </w:p>
+    <w:p>
+      <w:pPr>
+        <w:keepLines w:val="1"/>
+        <w:widowControl w:val="1"/>
+        <w:tabs>
+          <w:tab w:val="right" w:pos="10106"/>
+        </w:tabs>
+        <w:ind w:left="240" w:hanging="240"/>
+        <w:spacing w:before="20" w:after="30"/>
+      </w:pPr>
+      <w:r>
+        <w:rPr>
+          <w:sz w:val="19"/>
+          <w:color w:val="1E40AF"/>
+        </w:rPr>
+        <w:t xml:space="preserve">• </w:t>
+      </w:r>
+      <w:r>
+        <w:rPr>
+          <w:b/>
+          <w:sz w:val="19"/>
+          <w:color w:val="0F294A"/>
+        </w:rPr>
+        <w:t>Sun Certified Java Programmer (SCJP 5)</w:t>
+      </w:r>
+      <w:r>
+        <w:rPr>
+          <w:sz w:val="19"/>
+          <w:color w:val="64748B"/>
+        </w:rPr>
+        <w:t xml:space="preserve"> — Sun Microsystems</w:t>
+      </w:r>
+      <w:r>
+        <w:tab/>
+      </w:r>
+      <w:r>
+        <w:rPr>
+          <w:sz w:val="18"/>
+          <w:color w:val="475569"/>
+        </w:rPr>
+        <w:t>2006</w:t>
+      </w:r>
+    </w:p>
+    <w:p>
+      <w:pPr>
+        <w:keepLines w:val="1"/>
+        <w:widowControl w:val="1"/>
+        <w:tabs>
+          <w:tab w:val="right" w:pos="10106"/>
+        </w:tabs>
+        <w:ind w:left="240" w:hanging="240"/>
+        <w:spacing w:before="20" w:after="30"/>
+      </w:pPr>
+      <w:r>
+        <w:rPr>
+          <w:sz w:val="19"/>
+          <w:color w:val="1E40AF"/>
+        </w:rPr>
+        <w:t xml:space="preserve">• </w:t>
+      </w:r>
+      <w:r>
+        <w:rPr>
+          <w:b/>
+          <w:sz w:val="19"/>
+          <w:color w:val="0F294A"/>
+        </w:rPr>
+        <w:t>Linux Servers Administration Certification</w:t>
+      </w:r>
+      <w:r>
+        <w:rPr>
+          <w:sz w:val="19"/>
+          <w:color w:val="64748B"/>
+        </w:rPr>
+        <w:t xml:space="preserve"> — Linux Center</w:t>
+      </w:r>
+      <w:r>
+        <w:tab/>
+      </w:r>
+      <w:r>
+        <w:rPr>
+          <w:sz w:val="18"/>
+          <w:color w:val="475569"/>
+        </w:rPr>
+        <w:t>2002</w:t>
       </w:r>
     </w:p>
     <w:sectPr>

</xml_diff>